<commit_message>
[SAFRAN-1265] Upgrade templates and plugin to M2Doc 5
</commit_message>
<xml_diff>
--- a/samples/plugins/org.obeonetwork.is.samples/contents/E-BookStore/documentation/doc-src/E-BookStore_Cinematic_template.generated.docx
+++ b/samples/plugins/org.obeonetwork.is.samples/contents/E-BookStore/documentation/doc-src/E-BookStore_Cinematic_template.generated.docx
@@ -892,6 +892,27 @@
       </w:tr>
     </w:tbl>
     <w:p>
+      <w:pPr>
+        <w:pStyle w:val="western"/>
+        <w:spacing w:after="240"/>
+        <w:rPr>
+          <w:highlight w:val="green"/>
+        </w:rPr>
+      </w:pPr>
+      <w:pPr>
+        <w:pStyle w:val="western"/>
+        <w:spacing w:after="240"/>
+        <w:rPr>
+          <w:highlight w:val="green"/>
+        </w:rPr>
+      </w:pPr>
+      <w:pPr>
+        <w:pStyle w:val="western"/>
+        <w:spacing w:after="240"/>
+        <w:rPr>
+          <w:highlight w:val="green"/>
+        </w:rPr>
+      </w:pPr>
       <w:pPr>
         <w:pStyle w:val="western"/>
         <w:spacing w:after="240"/>
@@ -2051,12 +2072,12 @@
                     <w:drawing>
                       <wp:inline distT="0" distR="0" distB="0" distL="0">
                         <wp:extent cx="203200" cy="203200"/>
-                        <wp:docPr id="0" name="Drawing 0" descr="file:/tmp/CinematicRoot__47-1sBVIEeetFdz5pzgWAw2457421719552199320.png"/>
+                        <wp:docPr id="0" name="Drawing 0" descr="file:/C:/Users/VINCEN~1/AppData/Local/Temp/CinematicRoot__47-1sBVIEeetFdz5pzgWAw2192206307960961466.png"/>
                         <a:graphic xmlns:a="http://schemas.openxmlformats.org/drawingml/2006/main">
                           <a:graphicData uri="http://schemas.openxmlformats.org/drawingml/2006/picture">
                             <pic:pic xmlns:pic="http://schemas.openxmlformats.org/drawingml/2006/picture">
                               <pic:nvPicPr>
-                                <pic:cNvPr id="0" name="Picture 0" descr="file:/tmp/CinematicRoot__47-1sBVIEeetFdz5pzgWAw2457421719552199320.png"/>
+                                <pic:cNvPr id="0" name="Picture 0" descr="file:/C:/Users/VINCEN~1/AppData/Local/Temp/CinematicRoot__47-1sBVIEeetFdz5pzgWAw2192206307960961466.png"/>
                                 <pic:cNvPicPr>
                                   <a:picLocks noChangeAspect="true"/>
                                 </pic:cNvPicPr>
@@ -2117,12 +2138,12 @@
                     <w:drawing>
                       <wp:inline distT="0" distR="0" distB="0" distL="0">
                         <wp:extent cx="203200" cy="203200"/>
-                        <wp:docPr id="1" name="Drawing 1" descr="file:/tmp/Package__48qyPBVIEeetFdz5pzgWAw6317141299206139556.png"/>
+                        <wp:docPr id="1" name="Drawing 1" descr="file:/C:/Users/VINCEN~1/AppData/Local/Temp/Package__48qyPBVIEeetFdz5pzgWAw16850896341344039850.png"/>
                         <a:graphic xmlns:a="http://schemas.openxmlformats.org/drawingml/2006/main">
                           <a:graphicData uri="http://schemas.openxmlformats.org/drawingml/2006/picture">
                             <pic:pic xmlns:pic="http://schemas.openxmlformats.org/drawingml/2006/picture">
                               <pic:nvPicPr>
-                                <pic:cNvPr id="0" name="Picture 1" descr="file:/tmp/Package__48qyPBVIEeetFdz5pzgWAw6317141299206139556.png"/>
+                                <pic:cNvPr id="0" name="Picture 1" descr="file:/C:/Users/VINCEN~1/AppData/Local/Temp/Package__48qyPBVIEeetFdz5pzgWAw16850896341344039850.png"/>
                                 <pic:cNvPicPr>
                                   <a:picLocks noChangeAspect="true"/>
                                 </pic:cNvPicPr>
@@ -2183,12 +2204,12 @@
                     <w:drawing>
                       <wp:inline distT="0" distR="0" distB="0" distL="0">
                         <wp:extent cx="203200" cy="203200"/>
-                        <wp:docPr id="2" name="Drawing 2" descr="file:/tmp/ViewContainer__48gaJBVIEeetFdz5pzgWAw7627839229637117476.png"/>
+                        <wp:docPr id="2" name="Drawing 2" descr="file:/C:/Users/VINCEN~1/AppData/Local/Temp/ViewContainer__48gaJBVIEeetFdz5pzgWAw12764801775239818069.png"/>
                         <a:graphic xmlns:a="http://schemas.openxmlformats.org/drawingml/2006/main">
                           <a:graphicData uri="http://schemas.openxmlformats.org/drawingml/2006/picture">
                             <pic:pic xmlns:pic="http://schemas.openxmlformats.org/drawingml/2006/picture">
                               <pic:nvPicPr>
-                                <pic:cNvPr id="0" name="Picture 2" descr="file:/tmp/ViewContainer__48gaJBVIEeetFdz5pzgWAw7627839229637117476.png"/>
+                                <pic:cNvPr id="0" name="Picture 2" descr="file:/C:/Users/VINCEN~1/AppData/Local/Temp/ViewContainer__48gaJBVIEeetFdz5pzgWAw12764801775239818069.png"/>
                                 <pic:cNvPicPr>
                                   <a:picLocks noChangeAspect="true"/>
                                 </pic:cNvPicPr>
@@ -2249,12 +2270,12 @@
                     <w:drawing>
                       <wp:inline distT="0" distR="0" distB="0" distL="0">
                         <wp:extent cx="203200" cy="203200"/>
-                        <wp:docPr id="3" name="Drawing 3" descr="file:/tmp/ViewContainer__48qLRRVIEeetFdz5pzgWAw17101472733914911028.png"/>
+                        <wp:docPr id="3" name="Drawing 3" descr="file:/C:/Users/VINCEN~1/AppData/Local/Temp/ViewContainer__48qLRRVIEeetFdz5pzgWAw6088262142422843976.png"/>
                         <a:graphic xmlns:a="http://schemas.openxmlformats.org/drawingml/2006/main">
                           <a:graphicData uri="http://schemas.openxmlformats.org/drawingml/2006/picture">
                             <pic:pic xmlns:pic="http://schemas.openxmlformats.org/drawingml/2006/picture">
                               <pic:nvPicPr>
-                                <pic:cNvPr id="0" name="Picture 3" descr="file:/tmp/ViewContainer__48qLRRVIEeetFdz5pzgWAw17101472733914911028.png"/>
+                                <pic:cNvPr id="0" name="Picture 3" descr="file:/C:/Users/VINCEN~1/AppData/Local/Temp/ViewContainer__48qLRRVIEeetFdz5pzgWAw6088262142422843976.png"/>
                                 <pic:cNvPicPr>
                                   <a:picLocks noChangeAspect="true"/>
                                 </pic:cNvPicPr>
@@ -2315,12 +2336,12 @@
                     <w:drawing>
                       <wp:inline distT="0" distR="0" distB="0" distL="0">
                         <wp:extent cx="203200" cy="203200"/>
-                        <wp:docPr id="4" name="Drawing 4" descr="file:/tmp/Toolkit__IxeAcKLCEeuqs9mIRWXCLA17932569357210283273.png"/>
+                        <wp:docPr id="4" name="Drawing 4" descr="file:/C:/Users/VINCEN~1/AppData/Local/Temp/Toolkit__IxeAcKLCEeuqs9mIRWXCLA5730800309418987663.png"/>
                         <a:graphic xmlns:a="http://schemas.openxmlformats.org/drawingml/2006/main">
                           <a:graphicData uri="http://schemas.openxmlformats.org/drawingml/2006/picture">
                             <pic:pic xmlns:pic="http://schemas.openxmlformats.org/drawingml/2006/picture">
                               <pic:nvPicPr>
-                                <pic:cNvPr id="0" name="Picture 4" descr="file:/tmp/Toolkit__IxeAcKLCEeuqs9mIRWXCLA17932569357210283273.png"/>
+                                <pic:cNvPr id="0" name="Picture 4" descr="file:/C:/Users/VINCEN~1/AppData/Local/Temp/Toolkit__IxeAcKLCEeuqs9mIRWXCLA5730800309418987663.png"/>
                                 <pic:cNvPicPr>
                                   <a:picLocks noChangeAspect="true"/>
                                 </pic:cNvPicPr>
@@ -2605,12 +2626,12 @@
                     <w:drawing>
                       <wp:inline distT="0" distR="0" distB="0" distL="0">
                         <wp:extent cx="203200" cy="203200"/>
-                        <wp:docPr id="5" name="Drawing 5" descr="file:/tmp/ViewContainer__48gaJBVIEeetFdz5pzgWAw9361573764633183095.png"/>
+                        <wp:docPr id="5" name="Drawing 5" descr="file:/C:/Users/VINCEN~1/AppData/Local/Temp/ViewContainer__48gaJBVIEeetFdz5pzgWAw17352937961194606802.png"/>
                         <a:graphic xmlns:a="http://schemas.openxmlformats.org/drawingml/2006/main">
                           <a:graphicData uri="http://schemas.openxmlformats.org/drawingml/2006/picture">
                             <pic:pic xmlns:pic="http://schemas.openxmlformats.org/drawingml/2006/picture">
                               <pic:nvPicPr>
-                                <pic:cNvPr id="0" name="Picture 5" descr="file:/tmp/ViewContainer__48gaJBVIEeetFdz5pzgWAw9361573764633183095.png"/>
+                                <pic:cNvPr id="0" name="Picture 5" descr="file:/C:/Users/VINCEN~1/AppData/Local/Temp/ViewContainer__48gaJBVIEeetFdz5pzgWAw17352937961194606802.png"/>
                                 <pic:cNvPicPr>
                                   <a:picLocks noChangeAspect="true"/>
                                 </pic:cNvPicPr>
@@ -2671,12 +2692,12 @@
                     <w:drawing>
                       <wp:inline distT="0" distR="0" distB="0" distL="0">
                         <wp:extent cx="203200" cy="203200"/>
-                        <wp:docPr id="6" name="Drawing 6" descr="file:/tmp/ViewContainer__48jdcBVIEeetFdz5pzgWAw927050090001699788.png"/>
+                        <wp:docPr id="6" name="Drawing 6" descr="file:/C:/Users/VINCEN~1/AppData/Local/Temp/ViewContainer__48jdcBVIEeetFdz5pzgWAw11479620118096729165.png"/>
                         <a:graphic xmlns:a="http://schemas.openxmlformats.org/drawingml/2006/main">
                           <a:graphicData uri="http://schemas.openxmlformats.org/drawingml/2006/picture">
                             <pic:pic xmlns:pic="http://schemas.openxmlformats.org/drawingml/2006/picture">
                               <pic:nvPicPr>
-                                <pic:cNvPr id="0" name="Picture 6" descr="file:/tmp/ViewContainer__48jdcBVIEeetFdz5pzgWAw927050090001699788.png"/>
+                                <pic:cNvPr id="0" name="Picture 6" descr="file:/C:/Users/VINCEN~1/AppData/Local/Temp/ViewContainer__48jdcBVIEeetFdz5pzgWAw11479620118096729165.png"/>
                                 <pic:cNvPicPr>
                                   <a:picLocks noChangeAspect="true"/>
                                 </pic:cNvPicPr>
@@ -2737,12 +2758,12 @@
                     <w:drawing>
                       <wp:inline distT="0" distR="0" distB="0" distL="0">
                         <wp:extent cx="203200" cy="203200"/>
-                        <wp:docPr id="7" name="Drawing 7" descr="file:/tmp/ViewContainer__48qLIBVIEeetFdz5pzgWAw8580573725342588752.png"/>
+                        <wp:docPr id="7" name="Drawing 7" descr="file:/C:/Users/VINCEN~1/AppData/Local/Temp/ViewContainer__48qLIBVIEeetFdz5pzgWAw4835103658128997034.png"/>
                         <a:graphic xmlns:a="http://schemas.openxmlformats.org/drawingml/2006/main">
                           <a:graphicData uri="http://schemas.openxmlformats.org/drawingml/2006/picture">
                             <pic:pic xmlns:pic="http://schemas.openxmlformats.org/drawingml/2006/picture">
                               <pic:nvPicPr>
-                                <pic:cNvPr id="0" name="Picture 7" descr="file:/tmp/ViewContainer__48qLIBVIEeetFdz5pzgWAw8580573725342588752.png"/>
+                                <pic:cNvPr id="0" name="Picture 7" descr="file:/C:/Users/VINCEN~1/AppData/Local/Temp/ViewContainer__48qLIBVIEeetFdz5pzgWAw4835103658128997034.png"/>
                                 <pic:cNvPicPr>
                                   <a:picLocks noChangeAspect="true"/>
                                 </pic:cNvPicPr>
@@ -2803,12 +2824,12 @@
                     <w:drawing>
                       <wp:inline distT="0" distR="0" distB="0" distL="0">
                         <wp:extent cx="203200" cy="203200"/>
-                        <wp:docPr id="8" name="Drawing 8" descr="file:/tmp/ViewContainer__48qLLxVIEeetFdz5pzgWAw12379054279633608544.png"/>
+                        <wp:docPr id="8" name="Drawing 8" descr="file:/C:/Users/VINCEN~1/AppData/Local/Temp/ViewContainer__48qLLxVIEeetFdz5pzgWAw5313631181590071397.png"/>
                         <a:graphic xmlns:a="http://schemas.openxmlformats.org/drawingml/2006/main">
                           <a:graphicData uri="http://schemas.openxmlformats.org/drawingml/2006/picture">
                             <pic:pic xmlns:pic="http://schemas.openxmlformats.org/drawingml/2006/picture">
                               <pic:nvPicPr>
-                                <pic:cNvPr id="0" name="Picture 8" descr="file:/tmp/ViewContainer__48qLLxVIEeetFdz5pzgWAw12379054279633608544.png"/>
+                                <pic:cNvPr id="0" name="Picture 8" descr="file:/C:/Users/VINCEN~1/AppData/Local/Temp/ViewContainer__48qLLxVIEeetFdz5pzgWAw5313631181590071397.png"/>
                                 <pic:cNvPicPr>
                                   <a:picLocks noChangeAspect="true"/>
                                 </pic:cNvPicPr>
@@ -2868,40 +2889,101 @@
               <w:jc w:val="center"/>
             </w:pPr>
             <w:r>
-              <w:t/>
-              <w:drawing>
-                <wp:inline distT="0" distR="0" distB="0" distL="0">
-                  <wp:extent cx="5080000" cy="3365500"/>
-                  <wp:docPr id="9" name="Drawing 9" descr="file:/tmp/HomePage%20View%20Container%20Mockup_copy-m2doc5571146073472931877.jpg"/>
-                  <a:graphic xmlns:a="http://schemas.openxmlformats.org/drawingml/2006/main">
-                    <a:graphicData uri="http://schemas.openxmlformats.org/drawingml/2006/picture">
-                      <pic:pic xmlns:pic="http://schemas.openxmlformats.org/drawingml/2006/picture">
-                        <pic:nvPicPr>
-                          <pic:cNvPr id="0" name="Picture 9" descr="file:/tmp/HomePage%20View%20Container%20Mockup_copy-m2doc5571146073472931877.jpg"/>
-                          <pic:cNvPicPr>
-                            <a:picLocks noChangeAspect="true"/>
-                          </pic:cNvPicPr>
-                        </pic:nvPicPr>
-                        <pic:blipFill>
-                          <a:blip r:embed="rId18"/>
-                          <a:stretch>
-                            <a:fillRect/>
-                          </a:stretch>
-                        </pic:blipFill>
-                        <pic:spPr>
-                          <a:xfrm>
-                            <a:off x="0" y="0"/>
-                            <a:ext cx="5080000" cy="3365500"/>
-                          </a:xfrm>
-                          <a:prstGeom prst="rect">
-                            <a:avLst/>
-                          </a:prstGeom>
-                        </pic:spPr>
-                      </pic:pic>
-                    </a:graphicData>
-                  </a:graphic>
-                </wp:inline>
-              </w:drawing>
+              <w:t>{m:vc.asMockupImage(</w:t>
+            </w:r>
+            <w:r>
+              <w:t>4</w:t>
+            </w:r>
+            <w:r>
+              <w:t xml:space="preserve">00)}</w:t>
+            </w:r>
+            <w:r>
+              <w:rPr>
+                <w:b w:val="on"/>
+                <w:color w:val="FF0000"/>
+              </w:rPr>
+              <w:t xml:space="preserve">    &lt;---asMockupImage(org.obeonetwork.dsl.cinematic.view.ViewContainer,int) with arguments [ViewContainer[TRANSIENT], 400] failed:
+	java.lang.NullPointerException: Cannot invoke "org.eclipse.sirius.business.api.session.Session.getTransactionalEditingDomain()" because "session" is null
+		at org.obeonetwork.m2doc.sirius.services.M2DocSiriusServices.&lt;init&gt;(M2DocSiriusServices.java:206)
+		at org.obeonetwork.m2doc.sirius.services.M2DocSiriusServices.&lt;init&gt;(M2DocSiriusServices.java:189)
+		at org.obeonetwork.cinematic.m2doc.services.CinematicServices.asMockupImage(CinematicServices.java:804)
+		at java.base/jdk.internal.reflect.DirectMethodHandleAccessor.invoke(DirectMethodHandleAccessor.java:103)
+		at java.base/java.lang.reflect.Method.invoke(Method.java:580)
+		at org.eclipse.acceleo.query.runtime.impl.JavaMethodService.internalInvoke(JavaMethodService.java:170)
+		at org.eclipse.acceleo.query.runtime.impl.AbstractService.invoke(AbstractService.java:231)
+		at org.eclipse.acceleo.query.runtime.impl.EvaluationServices.internalCallService(EvaluationServices.java:122)
+		at org.eclipse.acceleo.query.runtime.impl.EvaluationServices.internalCall(EvaluationServices.java:237)
+		at org.eclipse.acceleo.query.runtime.impl.EvaluationServices.internalCallOrApply(EvaluationServices.java:273)
+		at org.eclipse.acceleo.query.runtime.impl.EvaluationServices.call(EvaluationServices.java:173)
+		at org.eclipse.acceleo.query.parser.AstEvaluator.caseCall(AstEvaluator.java:244)
+		at org.eclipse.acceleo.query.ast.util.AstSwitch.doSwitch(AstSwitch.java:135)
+		at org.eclipse.emf.ecore.util.Switch.doSwitch(Switch.java:53)
+		at org.eclipse.emf.ecore.util.Switch.doSwitch(Switch.java:69)
+		at org.eclipse.acceleo.query.parser.AstEvaluator.eval(AstEvaluator.java:146)
+		at org.eclipse.acceleo.query.runtime.impl.QueryEvaluationEngine.eval(QueryEvaluationEngine.java:53)
+		at org.obeonetwork.m2doc.generator.M2DocEvaluator.caseQuery(M2DocEvaluator.java:672)
+		at org.obeonetwork.m2doc.generator.M2DocEvaluator.caseQuery(M2DocEvaluator.java:1)
+		at org.obeonetwork.m2doc.template.util.TemplateSwitch.doSwitch(TemplateSwitch.java:186)
+		at org.eclipse.emf.ecore.util.Switch.doSwitch(Switch.java:53)
+		at org.eclipse.emf.ecore.util.Switch.doSwitch(Switch.java:69)
+		at org.obeonetwork.m2doc.generator.M2DocEvaluator.doSwitch(M2DocEvaluator.java:2141)
+		at org.obeonetwork.m2doc.generator.M2DocEvaluator.caseBlock(M2DocEvaluator.java:2366)
+		at org.obeonetwork.m2doc.generator.M2DocEvaluator.caseBlock(M2DocEvaluator.java:1)
+		at org.obeonetwork.m2doc.template.util.TemplateSwitch.doSwitch(TemplateSwitch.java:199)
+		at org.eclipse.emf.ecore.util.Switch.doSwitch(Switch.java:53)
+		at org.eclipse.emf.ecore.util.Switch.doSwitch(Switch.java:69)
+		at org.obeonetwork.m2doc.generator.M2DocEvaluator.doSwitch(M2DocEvaluator.java:2141)
+		at org.obeonetwork.m2doc.generator.M2DocEvaluator.caseCell(M2DocEvaluator.java:2483)
+		at org.obeonetwork.m2doc.generator.M2DocEvaluator.caseCell(M2DocEvaluator.java:1)
+		at org.obeonetwork.m2doc.template.util.TemplateSwitch.doSwitch(TemplateSwitch.java:272)
+		at org.eclipse.emf.ecore.util.Switch.doSwitch(Switch.java:53)
+		at org.eclipse.emf.ecore.util.Switch.doSwitch(Switch.java:69)
+		at org.obeonetwork.m2doc.generator.M2DocEvaluator.doSwitch(M2DocEvaluator.java:2141)
+		at org.obeonetwork.m2doc.generator.M2DocEvaluator.caseRow(M2DocEvaluator.java:2458)
+		at org.obeonetwork.m2doc.generator.M2DocEvaluator.caseRow(M2DocEvaluator.java:1)
+		at org.obeonetwork.m2doc.template.util.TemplateSwitch.doSwitch(TemplateSwitch.java:265)
+		at org.eclipse.emf.ecore.util.Switch.doSwitch(Switch.java:53)
+		at org.eclipse.emf.ecore.util.Switch.doSwitch(Switch.java:69)
+		at org.obeonetwork.m2doc.generator.M2DocEvaluator.doSwitch(M2DocEvaluator.java:2141)
+		at org.obeonetwork.m2doc.generator.M2DocEvaluator.caseTable(M2DocEvaluator.java:2420)
+		at org.obeonetwork.m2doc.generator.M2DocEvaluator.caseTable(M2DocEvaluator.java:1)
+		at org.obeonetwork.m2doc.template.util.TemplateSwitch.doSwitch(TemplateSwitch.java:252)
+		at org.eclipse.emf.ecore.util.Switch.doSwitch(Switch.java:53)
+		at org.eclipse.emf.ecore.util.Switch.doSwitch(Switch.java:69)
+		at org.obeonetwork.m2doc.generator.M2DocEvaluator.doSwitch(M2DocEvaluator.java:2141)
+		at org.obeonetwork.m2doc.generator.M2DocEvaluator.caseBlock(M2DocEvaluator.java:2366)
+		at org.obeonetwork.m2doc.generator.M2DocEvaluator.caseBlock(M2DocEvaluator.java:1)
+		at org.obeonetwork.m2doc.template.util.TemplateSwitch.doSwitch(TemplateSwitch.java:199)
+		at org.eclipse.emf.ecore.util.Switch.doSwitch(Switch.java:53)
+		at org.eclipse.emf.ecore.util.Switch.doSwitch(Switch.java:69)
+		at org.obeonetwork.m2doc.generator.M2DocEvaluator.doSwitch(M2DocEvaluator.java:2141)
+		at org.obeonetwork.m2doc.generator.M2DocEvaluator.caseRepetition(M2DocEvaluator.java:2125)
+		at org.obeonetwork.m2doc.generator.M2DocEvaluator.caseRepetition(M2DocEvaluator.java:1)
+		at org.obeonetwork.m2doc.template.util.TemplateSwitch.doSwitch(TemplateSwitch.java:147)
+		at org.eclipse.emf.ecore.util.Switch.doSwitch(Switch.java:53)
+		at org.eclipse.emf.ecore.util.Switch.doSwitch(Switch.java:69)
+		at org.obeonetwork.m2doc.generator.M2DocEvaluator.doSwitch(M2DocEvaluator.java:2141)
+		at org.obeonetwork.m2doc.generator.M2DocEvaluator.caseBlock(M2DocEvaluator.java:2366)
+		at org.obeonetwork.m2doc.generator.M2DocEvaluator.caseBlock(M2DocEvaluator.java:1)
+		at org.obeonetwork.m2doc.template.util.TemplateSwitch.doSwitch(TemplateSwitch.java:199)
+		at org.eclipse.emf.ecore.util.Switch.doSwitch(Switch.java:53)
+		at org.eclipse.emf.ecore.util.Switch.doSwitch(Switch.java:69)
+		at org.obeonetwork.m2doc.generator.M2DocEvaluator.doSwitch(M2DocEvaluator.java:2141)
+		at org.obeonetwork.m2doc.generator.M2DocEvaluator.caseDocumentTemplate(M2DocEvaluator.java:348)
+		at org.obeonetwork.m2doc.generator.M2DocEvaluator.caseDocumentTemplate(M2DocEvaluator.java:1)
+		at org.obeonetwork.m2doc.template.util.TemplateSwitch.doSwitch(TemplateSwitch.java:279)
+		at org.eclipse.emf.ecore.util.Switch.doSwitch(Switch.java:53)
+		at org.eclipse.emf.ecore.util.Switch.doSwitch(Switch.java:69)
+		at org.obeonetwork.m2doc.generator.M2DocEvaluator.doSwitch(M2DocEvaluator.java:2141)
+		at org.obeonetwork.m2doc.generator.M2DocEvaluator.generate(M2DocEvaluator.java:332)
+		at org.obeonetwork.m2doc.util.M2DocUtils.generate(M2DocUtils.java:823)
+		at org.obeonetwork.m2doc.genconf.GenconfUtils.generate(GenconfUtils.java:747)
+		at org.obeonetwork.m2doc.genconf.GenconfUtils.generate(GenconfUtils.java:669)
+		at org.obeonetwork.m2doc.genconf.editor.command.GenerateHandler$GenerateJob.runInWorkspace(GenerateHandler.java:115)
+		at org.eclipse.core.internal.resources.InternalWorkspaceJob.run(InternalWorkspaceJob.java:43)
+		at org.eclipse.core.internal.jobs.Worker.run(Worker.java:63)
+	</w:t>
+              <w:br/>
             </w:r>
           </w:p>
         </w:tc>
@@ -4529,12 +4611,12 @@
                     <w:drawing>
                       <wp:inline distT="0" distR="0" distB="0" distL="0">
                         <wp:extent cx="203200" cy="203200"/>
-                        <wp:docPr id="10" name="Drawing 10" descr="file:/tmp/ViewContainer__48qLRRVIEeetFdz5pzgWAw16045661521533859969.png"/>
+                        <wp:docPr id="9" name="Drawing 9" descr="file:/C:/Users/VINCEN~1/AppData/Local/Temp/ViewContainer__48qLRRVIEeetFdz5pzgWAw4523208022164576031.png"/>
                         <a:graphic xmlns:a="http://schemas.openxmlformats.org/drawingml/2006/main">
                           <a:graphicData uri="http://schemas.openxmlformats.org/drawingml/2006/picture">
                             <pic:pic xmlns:pic="http://schemas.openxmlformats.org/drawingml/2006/picture">
                               <pic:nvPicPr>
-                                <pic:cNvPr id="0" name="Picture 10" descr="file:/tmp/ViewContainer__48qLRRVIEeetFdz5pzgWAw16045661521533859969.png"/>
+                                <pic:cNvPr id="0" name="Picture 9" descr="file:/C:/Users/VINCEN~1/AppData/Local/Temp/ViewContainer__48qLRRVIEeetFdz5pzgWAw4523208022164576031.png"/>
                                 <pic:cNvPicPr>
                                   <a:picLocks noChangeAspect="true"/>
                                 </pic:cNvPicPr>
@@ -4594,40 +4676,101 @@
               <w:jc w:val="center"/>
             </w:pPr>
             <w:r>
-              <w:t/>
-              <w:drawing>
-                <wp:inline distT="0" distR="0" distB="0" distL="0">
-                  <wp:extent cx="5080000" cy="3352800"/>
-                  <wp:docPr id="11" name="Drawing 11" descr="file:/tmp/CreateAccount%20View%20Container%20Mockup_copy-m2doc7005410934931203809.jpg"/>
-                  <a:graphic xmlns:a="http://schemas.openxmlformats.org/drawingml/2006/main">
-                    <a:graphicData uri="http://schemas.openxmlformats.org/drawingml/2006/picture">
-                      <pic:pic xmlns:pic="http://schemas.openxmlformats.org/drawingml/2006/picture">
-                        <pic:nvPicPr>
-                          <pic:cNvPr id="0" name="Picture 11" descr="file:/tmp/CreateAccount%20View%20Container%20Mockup_copy-m2doc7005410934931203809.jpg"/>
-                          <pic:cNvPicPr>
-                            <a:picLocks noChangeAspect="true"/>
-                          </pic:cNvPicPr>
-                        </pic:nvPicPr>
-                        <pic:blipFill>
-                          <a:blip r:embed="rId19"/>
-                          <a:stretch>
-                            <a:fillRect/>
-                          </a:stretch>
-                        </pic:blipFill>
-                        <pic:spPr>
-                          <a:xfrm>
-                            <a:off x="0" y="0"/>
-                            <a:ext cx="5080000" cy="3352800"/>
-                          </a:xfrm>
-                          <a:prstGeom prst="rect">
-                            <a:avLst/>
-                          </a:prstGeom>
-                        </pic:spPr>
-                      </pic:pic>
-                    </a:graphicData>
-                  </a:graphic>
-                </wp:inline>
-              </w:drawing>
+              <w:t>{m:vc.asMockupImage(</w:t>
+            </w:r>
+            <w:r>
+              <w:t>4</w:t>
+            </w:r>
+            <w:r>
+              <w:t xml:space="preserve">00)}</w:t>
+            </w:r>
+            <w:r>
+              <w:rPr>
+                <w:b w:val="on"/>
+                <w:color w:val="FF0000"/>
+              </w:rPr>
+              <w:t xml:space="preserve">    &lt;---asMockupImage(org.obeonetwork.dsl.cinematic.view.ViewContainer,int) with arguments [ViewContainer[TRANSIENT], 400] failed:
+	java.lang.NullPointerException: Cannot invoke "org.eclipse.sirius.business.api.session.Session.getTransactionalEditingDomain()" because "session" is null
+		at org.obeonetwork.m2doc.sirius.services.M2DocSiriusServices.&lt;init&gt;(M2DocSiriusServices.java:206)
+		at org.obeonetwork.m2doc.sirius.services.M2DocSiriusServices.&lt;init&gt;(M2DocSiriusServices.java:189)
+		at org.obeonetwork.cinematic.m2doc.services.CinematicServices.asMockupImage(CinematicServices.java:804)
+		at java.base/jdk.internal.reflect.DirectMethodHandleAccessor.invoke(DirectMethodHandleAccessor.java:103)
+		at java.base/java.lang.reflect.Method.invoke(Method.java:580)
+		at org.eclipse.acceleo.query.runtime.impl.JavaMethodService.internalInvoke(JavaMethodService.java:170)
+		at org.eclipse.acceleo.query.runtime.impl.AbstractService.invoke(AbstractService.java:231)
+		at org.eclipse.acceleo.query.runtime.impl.EvaluationServices.internalCallService(EvaluationServices.java:122)
+		at org.eclipse.acceleo.query.runtime.impl.EvaluationServices.internalCall(EvaluationServices.java:237)
+		at org.eclipse.acceleo.query.runtime.impl.EvaluationServices.internalCallOrApply(EvaluationServices.java:273)
+		at org.eclipse.acceleo.query.runtime.impl.EvaluationServices.call(EvaluationServices.java:173)
+		at org.eclipse.acceleo.query.parser.AstEvaluator.caseCall(AstEvaluator.java:244)
+		at org.eclipse.acceleo.query.ast.util.AstSwitch.doSwitch(AstSwitch.java:135)
+		at org.eclipse.emf.ecore.util.Switch.doSwitch(Switch.java:53)
+		at org.eclipse.emf.ecore.util.Switch.doSwitch(Switch.java:69)
+		at org.eclipse.acceleo.query.parser.AstEvaluator.eval(AstEvaluator.java:146)
+		at org.eclipse.acceleo.query.runtime.impl.QueryEvaluationEngine.eval(QueryEvaluationEngine.java:53)
+		at org.obeonetwork.m2doc.generator.M2DocEvaluator.caseQuery(M2DocEvaluator.java:672)
+		at org.obeonetwork.m2doc.generator.M2DocEvaluator.caseQuery(M2DocEvaluator.java:1)
+		at org.obeonetwork.m2doc.template.util.TemplateSwitch.doSwitch(TemplateSwitch.java:186)
+		at org.eclipse.emf.ecore.util.Switch.doSwitch(Switch.java:53)
+		at org.eclipse.emf.ecore.util.Switch.doSwitch(Switch.java:69)
+		at org.obeonetwork.m2doc.generator.M2DocEvaluator.doSwitch(M2DocEvaluator.java:2141)
+		at org.obeonetwork.m2doc.generator.M2DocEvaluator.caseBlock(M2DocEvaluator.java:2366)
+		at org.obeonetwork.m2doc.generator.M2DocEvaluator.caseBlock(M2DocEvaluator.java:1)
+		at org.obeonetwork.m2doc.template.util.TemplateSwitch.doSwitch(TemplateSwitch.java:199)
+		at org.eclipse.emf.ecore.util.Switch.doSwitch(Switch.java:53)
+		at org.eclipse.emf.ecore.util.Switch.doSwitch(Switch.java:69)
+		at org.obeonetwork.m2doc.generator.M2DocEvaluator.doSwitch(M2DocEvaluator.java:2141)
+		at org.obeonetwork.m2doc.generator.M2DocEvaluator.caseCell(M2DocEvaluator.java:2483)
+		at org.obeonetwork.m2doc.generator.M2DocEvaluator.caseCell(M2DocEvaluator.java:1)
+		at org.obeonetwork.m2doc.template.util.TemplateSwitch.doSwitch(TemplateSwitch.java:272)
+		at org.eclipse.emf.ecore.util.Switch.doSwitch(Switch.java:53)
+		at org.eclipse.emf.ecore.util.Switch.doSwitch(Switch.java:69)
+		at org.obeonetwork.m2doc.generator.M2DocEvaluator.doSwitch(M2DocEvaluator.java:2141)
+		at org.obeonetwork.m2doc.generator.M2DocEvaluator.caseRow(M2DocEvaluator.java:2458)
+		at org.obeonetwork.m2doc.generator.M2DocEvaluator.caseRow(M2DocEvaluator.java:1)
+		at org.obeonetwork.m2doc.template.util.TemplateSwitch.doSwitch(TemplateSwitch.java:265)
+		at org.eclipse.emf.ecore.util.Switch.doSwitch(Switch.java:53)
+		at org.eclipse.emf.ecore.util.Switch.doSwitch(Switch.java:69)
+		at org.obeonetwork.m2doc.generator.M2DocEvaluator.doSwitch(M2DocEvaluator.java:2141)
+		at org.obeonetwork.m2doc.generator.M2DocEvaluator.caseTable(M2DocEvaluator.java:2420)
+		at org.obeonetwork.m2doc.generator.M2DocEvaluator.caseTable(M2DocEvaluator.java:1)
+		at org.obeonetwork.m2doc.template.util.TemplateSwitch.doSwitch(TemplateSwitch.java:252)
+		at org.eclipse.emf.ecore.util.Switch.doSwitch(Switch.java:53)
+		at org.eclipse.emf.ecore.util.Switch.doSwitch(Switch.java:69)
+		at org.obeonetwork.m2doc.generator.M2DocEvaluator.doSwitch(M2DocEvaluator.java:2141)
+		at org.obeonetwork.m2doc.generator.M2DocEvaluator.caseBlock(M2DocEvaluator.java:2366)
+		at org.obeonetwork.m2doc.generator.M2DocEvaluator.caseBlock(M2DocEvaluator.java:1)
+		at org.obeonetwork.m2doc.template.util.TemplateSwitch.doSwitch(TemplateSwitch.java:199)
+		at org.eclipse.emf.ecore.util.Switch.doSwitch(Switch.java:53)
+		at org.eclipse.emf.ecore.util.Switch.doSwitch(Switch.java:69)
+		at org.obeonetwork.m2doc.generator.M2DocEvaluator.doSwitch(M2DocEvaluator.java:2141)
+		at org.obeonetwork.m2doc.generator.M2DocEvaluator.caseRepetition(M2DocEvaluator.java:2125)
+		at org.obeonetwork.m2doc.generator.M2DocEvaluator.caseRepetition(M2DocEvaluator.java:1)
+		at org.obeonetwork.m2doc.template.util.TemplateSwitch.doSwitch(TemplateSwitch.java:147)
+		at org.eclipse.emf.ecore.util.Switch.doSwitch(Switch.java:53)
+		at org.eclipse.emf.ecore.util.Switch.doSwitch(Switch.java:69)
+		at org.obeonetwork.m2doc.generator.M2DocEvaluator.doSwitch(M2DocEvaluator.java:2141)
+		at org.obeonetwork.m2doc.generator.M2DocEvaluator.caseBlock(M2DocEvaluator.java:2366)
+		at org.obeonetwork.m2doc.generator.M2DocEvaluator.caseBlock(M2DocEvaluator.java:1)
+		at org.obeonetwork.m2doc.template.util.TemplateSwitch.doSwitch(TemplateSwitch.java:199)
+		at org.eclipse.emf.ecore.util.Switch.doSwitch(Switch.java:53)
+		at org.eclipse.emf.ecore.util.Switch.doSwitch(Switch.java:69)
+		at org.obeonetwork.m2doc.generator.M2DocEvaluator.doSwitch(M2DocEvaluator.java:2141)
+		at org.obeonetwork.m2doc.generator.M2DocEvaluator.caseDocumentTemplate(M2DocEvaluator.java:348)
+		at org.obeonetwork.m2doc.generator.M2DocEvaluator.caseDocumentTemplate(M2DocEvaluator.java:1)
+		at org.obeonetwork.m2doc.template.util.TemplateSwitch.doSwitch(TemplateSwitch.java:279)
+		at org.eclipse.emf.ecore.util.Switch.doSwitch(Switch.java:53)
+		at org.eclipse.emf.ecore.util.Switch.doSwitch(Switch.java:69)
+		at org.obeonetwork.m2doc.generator.M2DocEvaluator.doSwitch(M2DocEvaluator.java:2141)
+		at org.obeonetwork.m2doc.generator.M2DocEvaluator.generate(M2DocEvaluator.java:332)
+		at org.obeonetwork.m2doc.util.M2DocUtils.generate(M2DocUtils.java:823)
+		at org.obeonetwork.m2doc.genconf.GenconfUtils.generate(GenconfUtils.java:747)
+		at org.obeonetwork.m2doc.genconf.GenconfUtils.generate(GenconfUtils.java:669)
+		at org.obeonetwork.m2doc.genconf.editor.command.GenerateHandler$GenerateJob.runInWorkspace(GenerateHandler.java:115)
+		at org.eclipse.core.internal.resources.InternalWorkspaceJob.run(InternalWorkspaceJob.java:43)
+		at org.eclipse.core.internal.jobs.Worker.run(Worker.java:63)
+	</w:t>
+              <w:br/>
             </w:r>
           </w:p>
         </w:tc>
@@ -7025,12 +7168,12 @@
                     <w:drawing>
                       <wp:inline distT="0" distR="0" distB="0" distL="0">
                         <wp:extent cx="203200" cy="203200"/>
-                        <wp:docPr id="12" name="Drawing 12" descr="file:/tmp/Package__48qyPBVIEeetFdz5pzgWAw13769370124427966298.png"/>
+                        <wp:docPr id="10" name="Drawing 10" descr="file:/C:/Users/VINCEN~1/AppData/Local/Temp/Package__48qyPBVIEeetFdz5pzgWAw16619903587769093955.png"/>
                         <a:graphic xmlns:a="http://schemas.openxmlformats.org/drawingml/2006/main">
                           <a:graphicData uri="http://schemas.openxmlformats.org/drawingml/2006/picture">
                             <pic:pic xmlns:pic="http://schemas.openxmlformats.org/drawingml/2006/picture">
                               <pic:nvPicPr>
-                                <pic:cNvPr id="0" name="Picture 12" descr="file:/tmp/Package__48qyPBVIEeetFdz5pzgWAw13769370124427966298.png"/>
+                                <pic:cNvPr id="0" name="Picture 10" descr="file:/C:/Users/VINCEN~1/AppData/Local/Temp/Package__48qyPBVIEeetFdz5pzgWAw16619903587769093955.png"/>
                                 <pic:cNvPicPr>
                                   <a:picLocks noChangeAspect="true"/>
                                 </pic:cNvPicPr>
@@ -7091,12 +7234,12 @@
                     <w:drawing>
                       <wp:inline distT="0" distR="0" distB="0" distL="0">
                         <wp:extent cx="203200" cy="203200"/>
-                        <wp:docPr id="13" name="Drawing 13" descr="file:/tmp/ViewContainer__48vDrhVIEeetFdz5pzgWAw12638976890474204377.png"/>
+                        <wp:docPr id="11" name="Drawing 11" descr="file:/C:/Users/VINCEN~1/AppData/Local/Temp/ViewContainer__48vDrhVIEeetFdz5pzgWAw5556194371962783588.png"/>
                         <a:graphic xmlns:a="http://schemas.openxmlformats.org/drawingml/2006/main">
                           <a:graphicData uri="http://schemas.openxmlformats.org/drawingml/2006/picture">
                             <pic:pic xmlns:pic="http://schemas.openxmlformats.org/drawingml/2006/picture">
                               <pic:nvPicPr>
-                                <pic:cNvPr id="0" name="Picture 13" descr="file:/tmp/ViewContainer__48vDrhVIEeetFdz5pzgWAw12638976890474204377.png"/>
+                                <pic:cNvPr id="0" name="Picture 11" descr="file:/C:/Users/VINCEN~1/AppData/Local/Temp/ViewContainer__48vDrhVIEeetFdz5pzgWAw5556194371962783588.png"/>
                                 <pic:cNvPicPr>
                                   <a:picLocks noChangeAspect="true"/>
                                 </pic:cNvPicPr>
@@ -7157,12 +7300,12 @@
                     <w:drawing>
                       <wp:inline distT="0" distR="0" distB="0" distL="0">
                         <wp:extent cx="203200" cy="203200"/>
-                        <wp:docPr id="14" name="Drawing 14" descr="file:/tmp/ViewContainer__48vDwBVIEeetFdz5pzgWAw4889815883873662578.png"/>
+                        <wp:docPr id="12" name="Drawing 12" descr="file:/C:/Users/VINCEN~1/AppData/Local/Temp/ViewContainer__48vDwBVIEeetFdz5pzgWAw2367417259919189993.png"/>
                         <a:graphic xmlns:a="http://schemas.openxmlformats.org/drawingml/2006/main">
                           <a:graphicData uri="http://schemas.openxmlformats.org/drawingml/2006/picture">
                             <pic:pic xmlns:pic="http://schemas.openxmlformats.org/drawingml/2006/picture">
                               <pic:nvPicPr>
-                                <pic:cNvPr id="0" name="Picture 14" descr="file:/tmp/ViewContainer__48vDwBVIEeetFdz5pzgWAw4889815883873662578.png"/>
+                                <pic:cNvPr id="0" name="Picture 12" descr="file:/C:/Users/VINCEN~1/AppData/Local/Temp/ViewContainer__48vDwBVIEeetFdz5pzgWAw2367417259919189993.png"/>
                                 <pic:cNvPicPr>
                                   <a:picLocks noChangeAspect="true"/>
                                 </pic:cNvPicPr>
@@ -7427,12 +7570,12 @@
                     <w:drawing>
                       <wp:inline distT="0" distR="0" distB="0" distL="0">
                         <wp:extent cx="203200" cy="203200"/>
-                        <wp:docPr id="15" name="Drawing 15" descr="file:/tmp/ViewContainer__48vDrhVIEeetFdz5pzgWAw18326510860031790017.png"/>
+                        <wp:docPr id="13" name="Drawing 13" descr="file:/C:/Users/VINCEN~1/AppData/Local/Temp/ViewContainer__48vDrhVIEeetFdz5pzgWAw14433254599749760522.png"/>
                         <a:graphic xmlns:a="http://schemas.openxmlformats.org/drawingml/2006/main">
                           <a:graphicData uri="http://schemas.openxmlformats.org/drawingml/2006/picture">
                             <pic:pic xmlns:pic="http://schemas.openxmlformats.org/drawingml/2006/picture">
                               <pic:nvPicPr>
-                                <pic:cNvPr id="0" name="Picture 15" descr="file:/tmp/ViewContainer__48vDrhVIEeetFdz5pzgWAw18326510860031790017.png"/>
+                                <pic:cNvPr id="0" name="Picture 13" descr="file:/C:/Users/VINCEN~1/AppData/Local/Temp/ViewContainer__48vDrhVIEeetFdz5pzgWAw14433254599749760522.png"/>
                                 <pic:cNvPicPr>
                                   <a:picLocks noChangeAspect="true"/>
                                 </pic:cNvPicPr>
@@ -9390,12 +9533,12 @@
                     <w:drawing>
                       <wp:inline distT="0" distR="0" distB="0" distL="0">
                         <wp:extent cx="203200" cy="203200"/>
-                        <wp:docPr id="16" name="Drawing 16" descr="file:/tmp/ViewContainer__48vDwBVIEeetFdz5pzgWAw16037760972367367195.png"/>
+                        <wp:docPr id="14" name="Drawing 14" descr="file:/C:/Users/VINCEN~1/AppData/Local/Temp/ViewContainer__48vDwBVIEeetFdz5pzgWAw4411442185533013695.png"/>
                         <a:graphic xmlns:a="http://schemas.openxmlformats.org/drawingml/2006/main">
                           <a:graphicData uri="http://schemas.openxmlformats.org/drawingml/2006/picture">
                             <pic:pic xmlns:pic="http://schemas.openxmlformats.org/drawingml/2006/picture">
                               <pic:nvPicPr>
-                                <pic:cNvPr id="0" name="Picture 16" descr="file:/tmp/ViewContainer__48vDwBVIEeetFdz5pzgWAw16037760972367367195.png"/>
+                                <pic:cNvPr id="0" name="Picture 14" descr="file:/C:/Users/VINCEN~1/AppData/Local/Temp/ViewContainer__48vDwBVIEeetFdz5pzgWAw4411442185533013695.png"/>
                                 <pic:cNvPicPr>
                                   <a:picLocks noChangeAspect="true"/>
                                 </pic:cNvPicPr>
@@ -11696,64 +11839,6 @@
       </w:r>
     </w:p>
     <w:p>
-      <w:r>
-        <w:t/>
-        <w:drawing>
-          <wp:inline distT="0" distR="0" distB="0" distL="0">
-            <wp:extent cx="5080000" cy="2222500"/>
-            <wp:docPr id="17" name="Drawing 17" descr="file:/tmp/E-BookStore%20Package%20Diagram_copy-m2doc14743081942175294615.jpg"/>
-            <a:graphic xmlns:a="http://schemas.openxmlformats.org/drawingml/2006/main">
-              <a:graphicData uri="http://schemas.openxmlformats.org/drawingml/2006/picture">
-                <pic:pic xmlns:pic="http://schemas.openxmlformats.org/drawingml/2006/picture">
-                  <pic:nvPicPr>
-                    <pic:cNvPr id="0" name="Picture 17" descr="file:/tmp/E-BookStore%20Package%20Diagram_copy-m2doc14743081942175294615.jpg"/>
-                    <pic:cNvPicPr>
-                      <a:picLocks noChangeAspect="true"/>
-                    </pic:cNvPicPr>
-                  </pic:nvPicPr>
-                  <pic:blipFill>
-                    <a:blip r:embed="rId20"/>
-                    <a:stretch>
-                      <a:fillRect/>
-                    </a:stretch>
-                  </pic:blipFill>
-                  <pic:spPr>
-                    <a:xfrm>
-                      <a:off x="0" y="0"/>
-                      <a:ext cx="5080000" cy="2222500"/>
-                    </a:xfrm>
-                    <a:prstGeom prst="rect">
-                      <a:avLst/>
-                    </a:prstGeom>
-                  </pic:spPr>
-                </pic:pic>
-              </a:graphicData>
-            </a:graphic>
-          </wp:inline>
-        </w:drawing>
-      </w:r>
-    </w:p>
-    <w:p>
-      <w:pPr>
-        <w:jc w:val="center"/>
-      </w:pPr>
-      <w:r>
-        <w:t>[</w:t>
-      </w:r>
-      <w:r>
-        <w:t xml:space="preserve"> </w:t>
-      </w:r>
-      <w:r>
-        <w:t>E-BookStore Package Diagram</w:t>
-      </w:r>
-      <w:r>
-        <w:t xml:space="preserve"> </w:t>
-      </w:r>
-      <w:r>
-        <w:t>]</w:t>
-      </w:r>
-    </w:p>
-    <w:p>
       <w:pPr>
         <w:pStyle w:val="Titre3"/>
       </w:pPr>
@@ -11877,64 +11962,6 @@
       </w:r>
       <w:r>
         <w:t>graphique</w:t>
-      </w:r>
-    </w:p>
-    <w:p>
-      <w:r>
-        <w:t/>
-        <w:drawing>
-          <wp:inline distT="0" distR="0" distB="0" distL="0">
-            <wp:extent cx="5080000" cy="2616200"/>
-            <wp:docPr id="18" name="Drawing 18" descr="file:/tmp/Main%20Flow%20Diagram_copy-m2doc4314139412061210898.jpg"/>
-            <a:graphic xmlns:a="http://schemas.openxmlformats.org/drawingml/2006/main">
-              <a:graphicData uri="http://schemas.openxmlformats.org/drawingml/2006/picture">
-                <pic:pic xmlns:pic="http://schemas.openxmlformats.org/drawingml/2006/picture">
-                  <pic:nvPicPr>
-                    <pic:cNvPr id="0" name="Picture 18" descr="file:/tmp/Main%20Flow%20Diagram_copy-m2doc4314139412061210898.jpg"/>
-                    <pic:cNvPicPr>
-                      <a:picLocks noChangeAspect="true"/>
-                    </pic:cNvPicPr>
-                  </pic:nvPicPr>
-                  <pic:blipFill>
-                    <a:blip r:embed="rId21"/>
-                    <a:stretch>
-                      <a:fillRect/>
-                    </a:stretch>
-                  </pic:blipFill>
-                  <pic:spPr>
-                    <a:xfrm>
-                      <a:off x="0" y="0"/>
-                      <a:ext cx="5080000" cy="2616200"/>
-                    </a:xfrm>
-                    <a:prstGeom prst="rect">
-                      <a:avLst/>
-                    </a:prstGeom>
-                  </pic:spPr>
-                </pic:pic>
-              </a:graphicData>
-            </a:graphic>
-          </wp:inline>
-        </w:drawing>
-      </w:r>
-    </w:p>
-    <w:p>
-      <w:pPr>
-        <w:jc w:val="center"/>
-      </w:pPr>
-      <w:r>
-        <w:t>[</w:t>
-      </w:r>
-      <w:r>
-        <w:t xml:space="preserve"> </w:t>
-      </w:r>
-      <w:r>
-        <w:t>Main Flow Diagram</w:t>
-      </w:r>
-      <w:r>
-        <w:t xml:space="preserve"> </w:t>
-      </w:r>
-      <w:r>
-        <w:t>]</w:t>
       </w:r>
     </w:p>
     <w:p>
@@ -17491,64 +17518,6 @@
       </w:r>
     </w:p>
     <w:p>
-      <w:r>
-        <w:t/>
-        <w:drawing>
-          <wp:inline distT="0" distR="0" distB="0" distL="0">
-            <wp:extent cx="5080000" cy="4775200"/>
-            <wp:docPr id="19" name="Drawing 19" descr="file:/tmp/Checkout%20Flow%20Diagram_copy-m2doc14226501123629936369.jpg"/>
-            <a:graphic xmlns:a="http://schemas.openxmlformats.org/drawingml/2006/main">
-              <a:graphicData uri="http://schemas.openxmlformats.org/drawingml/2006/picture">
-                <pic:pic xmlns:pic="http://schemas.openxmlformats.org/drawingml/2006/picture">
-                  <pic:nvPicPr>
-                    <pic:cNvPr id="0" name="Picture 19" descr="file:/tmp/Checkout%20Flow%20Diagram_copy-m2doc14226501123629936369.jpg"/>
-                    <pic:cNvPicPr>
-                      <a:picLocks noChangeAspect="true"/>
-                    </pic:cNvPicPr>
-                  </pic:nvPicPr>
-                  <pic:blipFill>
-                    <a:blip r:embed="rId22"/>
-                    <a:stretch>
-                      <a:fillRect/>
-                    </a:stretch>
-                  </pic:blipFill>
-                  <pic:spPr>
-                    <a:xfrm>
-                      <a:off x="0" y="0"/>
-                      <a:ext cx="5080000" cy="4775200"/>
-                    </a:xfrm>
-                    <a:prstGeom prst="rect">
-                      <a:avLst/>
-                    </a:prstGeom>
-                  </pic:spPr>
-                </pic:pic>
-              </a:graphicData>
-            </a:graphic>
-          </wp:inline>
-        </w:drawing>
-      </w:r>
-    </w:p>
-    <w:p>
-      <w:pPr>
-        <w:jc w:val="center"/>
-      </w:pPr>
-      <w:r>
-        <w:t>[</w:t>
-      </w:r>
-      <w:r>
-        <w:t xml:space="preserve"> </w:t>
-      </w:r>
-      <w:r>
-        <w:t>Checkout Flow Diagram</w:t>
-      </w:r>
-      <w:r>
-        <w:t xml:space="preserve"> </w:t>
-      </w:r>
-      <w:r>
-        <w:t>]</w:t>
-      </w:r>
-    </w:p>
-    <w:p>
       <w:pPr>
         <w:pStyle w:val="Titre5"/>
       </w:pPr>
@@ -22296,12 +22265,12 @@
               <w:drawing>
                 <wp:inline distT="0" distR="0" distB="0" distL="0">
                   <wp:extent cx="203200" cy="203200"/>
-                  <wp:docPr id="20" name="Drawing 20" descr="file:/tmp/ViewContainer__48gaJBVIEeetFdz5pzgWAw6958102869204187978.png"/>
+                  <wp:docPr id="15" name="Drawing 15" descr="file:/C:/Users/VINCEN~1/AppData/Local/Temp/ViewContainer__48gaJBVIEeetFdz5pzgWAw10824702595671090686.png"/>
                   <a:graphic xmlns:a="http://schemas.openxmlformats.org/drawingml/2006/main">
                     <a:graphicData uri="http://schemas.openxmlformats.org/drawingml/2006/picture">
                       <pic:pic xmlns:pic="http://schemas.openxmlformats.org/drawingml/2006/picture">
                         <pic:nvPicPr>
-                          <pic:cNvPr id="0" name="Picture 20" descr="file:/tmp/ViewContainer__48gaJBVIEeetFdz5pzgWAw6958102869204187978.png"/>
+                          <pic:cNvPr id="0" name="Picture 15" descr="file:/C:/Users/VINCEN~1/AppData/Local/Temp/ViewContainer__48gaJBVIEeetFdz5pzgWAw10824702595671090686.png"/>
                           <pic:cNvPicPr>
                             <a:picLocks noChangeAspect="true"/>
                           </pic:cNvPicPr>
@@ -22356,12 +22325,12 @@
               <w:drawing>
                 <wp:inline distT="0" distR="0" distB="0" distL="0">
                   <wp:extent cx="203200" cy="203200"/>
-                  <wp:docPr id="21" name="Drawing 21" descr="file:/tmp/ViewContainer__48jdcBVIEeetFdz5pzgWAw5385465760142408648.png"/>
+                  <wp:docPr id="16" name="Drawing 16" descr="file:/C:/Users/VINCEN~1/AppData/Local/Temp/ViewContainer__48jdcBVIEeetFdz5pzgWAw8943584550899959825.png"/>
                   <a:graphic xmlns:a="http://schemas.openxmlformats.org/drawingml/2006/main">
                     <a:graphicData uri="http://schemas.openxmlformats.org/drawingml/2006/picture">
                       <pic:pic xmlns:pic="http://schemas.openxmlformats.org/drawingml/2006/picture">
                         <pic:nvPicPr>
-                          <pic:cNvPr id="0" name="Picture 21" descr="file:/tmp/ViewContainer__48jdcBVIEeetFdz5pzgWAw5385465760142408648.png"/>
+                          <pic:cNvPr id="0" name="Picture 16" descr="file:/C:/Users/VINCEN~1/AppData/Local/Temp/ViewContainer__48jdcBVIEeetFdz5pzgWAw8943584550899959825.png"/>
                           <pic:cNvPicPr>
                             <a:picLocks noChangeAspect="true"/>
                           </pic:cNvPicPr>
@@ -22416,12 +22385,12 @@
               <w:drawing>
                 <wp:inline distT="0" distR="0" distB="0" distL="0">
                   <wp:extent cx="203200" cy="203200"/>
-                  <wp:docPr id="22" name="Drawing 22" descr="file:/tmp/ViewContainer__48qLIBVIEeetFdz5pzgWAw9571656690080389050.png"/>
+                  <wp:docPr id="17" name="Drawing 17" descr="file:/C:/Users/VINCEN~1/AppData/Local/Temp/ViewContainer__48qLIBVIEeetFdz5pzgWAw1787670962979981331.png"/>
                   <a:graphic xmlns:a="http://schemas.openxmlformats.org/drawingml/2006/main">
                     <a:graphicData uri="http://schemas.openxmlformats.org/drawingml/2006/picture">
                       <pic:pic xmlns:pic="http://schemas.openxmlformats.org/drawingml/2006/picture">
                         <pic:nvPicPr>
-                          <pic:cNvPr id="0" name="Picture 22" descr="file:/tmp/ViewContainer__48qLIBVIEeetFdz5pzgWAw9571656690080389050.png"/>
+                          <pic:cNvPr id="0" name="Picture 17" descr="file:/C:/Users/VINCEN~1/AppData/Local/Temp/ViewContainer__48qLIBVIEeetFdz5pzgWAw1787670962979981331.png"/>
                           <pic:cNvPicPr>
                             <a:picLocks noChangeAspect="true"/>
                           </pic:cNvPicPr>
@@ -22476,12 +22445,12 @@
               <w:drawing>
                 <wp:inline distT="0" distR="0" distB="0" distL="0">
                   <wp:extent cx="203200" cy="203200"/>
-                  <wp:docPr id="23" name="Drawing 23" descr="file:/tmp/ViewContainer__48qLLxVIEeetFdz5pzgWAw14209577778372088520.png"/>
+                  <wp:docPr id="18" name="Drawing 18" descr="file:/C:/Users/VINCEN~1/AppData/Local/Temp/ViewContainer__48qLLxVIEeetFdz5pzgWAw45359836176618357.png"/>
                   <a:graphic xmlns:a="http://schemas.openxmlformats.org/drawingml/2006/main">
                     <a:graphicData uri="http://schemas.openxmlformats.org/drawingml/2006/picture">
                       <pic:pic xmlns:pic="http://schemas.openxmlformats.org/drawingml/2006/picture">
                         <pic:nvPicPr>
-                          <pic:cNvPr id="0" name="Picture 23" descr="file:/tmp/ViewContainer__48qLLxVIEeetFdz5pzgWAw14209577778372088520.png"/>
+                          <pic:cNvPr id="0" name="Picture 18" descr="file:/C:/Users/VINCEN~1/AppData/Local/Temp/ViewContainer__48qLLxVIEeetFdz5pzgWAw45359836176618357.png"/>
                           <pic:cNvPicPr>
                             <a:picLocks noChangeAspect="true"/>
                           </pic:cNvPicPr>
@@ -22536,18 +22505,18 @@
               <w:drawing>
                 <wp:inline distT="0" distR="0" distB="0" distL="0">
                   <wp:extent cx="203200" cy="177800"/>
-                  <wp:docPr id="24" name="Drawing 24" descr="file:/tmp/ViewElement__48qLLBVIEeetFdz5pzgWAw4668451497267834756.png"/>
+                  <wp:docPr id="19" name="Drawing 19" descr="file:/C:/Users/VINCEN~1/AppData/Local/Temp/ViewElement__48qLLBVIEeetFdz5pzgWAw8459146875179352676.png"/>
                   <a:graphic xmlns:a="http://schemas.openxmlformats.org/drawingml/2006/main">
                     <a:graphicData uri="http://schemas.openxmlformats.org/drawingml/2006/picture">
                       <pic:pic xmlns:pic="http://schemas.openxmlformats.org/drawingml/2006/picture">
                         <pic:nvPicPr>
-                          <pic:cNvPr id="0" name="Picture 24" descr="file:/tmp/ViewElement__48qLLBVIEeetFdz5pzgWAw4668451497267834756.png"/>
+                          <pic:cNvPr id="0" name="Picture 19" descr="file:/C:/Users/VINCEN~1/AppData/Local/Temp/ViewElement__48qLLBVIEeetFdz5pzgWAw8459146875179352676.png"/>
                           <pic:cNvPicPr>
                             <a:picLocks noChangeAspect="true"/>
                           </pic:cNvPicPr>
                         </pic:nvPicPr>
                         <pic:blipFill>
-                          <a:blip r:embed="rId23"/>
+                          <a:blip r:embed="rId18"/>
                           <a:stretch>
                             <a:fillRect/>
                           </a:stretch>
@@ -22643,12 +22612,12 @@
               <w:drawing>
                 <wp:inline distT="0" distR="0" distB="0" distL="0">
                   <wp:extent cx="203200" cy="203200"/>
-                  <wp:docPr id="25" name="Drawing 25" descr="file:/tmp/ViewContainer__48qLRRVIEeetFdz5pzgWAw13772268404854301693.png"/>
+                  <wp:docPr id="20" name="Drawing 20" descr="file:/C:/Users/VINCEN~1/AppData/Local/Temp/ViewContainer__48qLRRVIEeetFdz5pzgWAw15283794133995158560.png"/>
                   <a:graphic xmlns:a="http://schemas.openxmlformats.org/drawingml/2006/main">
                     <a:graphicData uri="http://schemas.openxmlformats.org/drawingml/2006/picture">
                       <pic:pic xmlns:pic="http://schemas.openxmlformats.org/drawingml/2006/picture">
                         <pic:nvPicPr>
-                          <pic:cNvPr id="0" name="Picture 25" descr="file:/tmp/ViewContainer__48qLRRVIEeetFdz5pzgWAw13772268404854301693.png"/>
+                          <pic:cNvPr id="0" name="Picture 20" descr="file:/C:/Users/VINCEN~1/AppData/Local/Temp/ViewContainer__48qLRRVIEeetFdz5pzgWAw15283794133995158560.png"/>
                           <pic:cNvPicPr>
                             <a:picLocks noChangeAspect="true"/>
                           </pic:cNvPicPr>
@@ -22703,18 +22672,18 @@
               <w:drawing>
                 <wp:inline distT="0" distR="0" distB="0" distL="0">
                   <wp:extent cx="203200" cy="177800"/>
-                  <wp:docPr id="26" name="Drawing 26" descr="file:/tmp/ViewElement__48qLRxVIEeetFdz5pzgWAw6301490764100725916.png"/>
+                  <wp:docPr id="21" name="Drawing 21" descr="file:/C:/Users/VINCEN~1/AppData/Local/Temp/ViewElement__48qLRxVIEeetFdz5pzgWAw2776047687068839606.png"/>
                   <a:graphic xmlns:a="http://schemas.openxmlformats.org/drawingml/2006/main">
                     <a:graphicData uri="http://schemas.openxmlformats.org/drawingml/2006/picture">
                       <pic:pic xmlns:pic="http://schemas.openxmlformats.org/drawingml/2006/picture">
                         <pic:nvPicPr>
-                          <pic:cNvPr id="0" name="Picture 26" descr="file:/tmp/ViewElement__48qLRxVIEeetFdz5pzgWAw6301490764100725916.png"/>
+                          <pic:cNvPr id="0" name="Picture 21" descr="file:/C:/Users/VINCEN~1/AppData/Local/Temp/ViewElement__48qLRxVIEeetFdz5pzgWAw2776047687068839606.png"/>
                           <pic:cNvPicPr>
                             <a:picLocks noChangeAspect="true"/>
                           </pic:cNvPicPr>
                         </pic:nvPicPr>
                         <pic:blipFill>
-                          <a:blip r:embed="rId24"/>
+                          <a:blip r:embed="rId19"/>
                           <a:stretch>
                             <a:fillRect/>
                           </a:stretch>
@@ -22763,18 +22732,18 @@
               <w:drawing>
                 <wp:inline distT="0" distR="0" distB="0" distL="0">
                   <wp:extent cx="203200" cy="203200"/>
-                  <wp:docPr id="27" name="Drawing 27" descr="file:/tmp/ViewElement__48qyMBVIEeetFdz5pzgWAw16482381456849494024.png"/>
+                  <wp:docPr id="22" name="Drawing 22" descr="file:/C:/Users/VINCEN~1/AppData/Local/Temp/ViewElement__48qyMBVIEeetFdz5pzgWAw992619347515705956.png"/>
                   <a:graphic xmlns:a="http://schemas.openxmlformats.org/drawingml/2006/main">
                     <a:graphicData uri="http://schemas.openxmlformats.org/drawingml/2006/picture">
                       <pic:pic xmlns:pic="http://schemas.openxmlformats.org/drawingml/2006/picture">
                         <pic:nvPicPr>
-                          <pic:cNvPr id="0" name="Picture 27" descr="file:/tmp/ViewElement__48qyMBVIEeetFdz5pzgWAw16482381456849494024.png"/>
+                          <pic:cNvPr id="0" name="Picture 22" descr="file:/C:/Users/VINCEN~1/AppData/Local/Temp/ViewElement__48qyMBVIEeetFdz5pzgWAw992619347515705956.png"/>
                           <pic:cNvPicPr>
                             <a:picLocks noChangeAspect="true"/>
                           </pic:cNvPicPr>
                         </pic:nvPicPr>
                         <pic:blipFill>
-                          <a:blip r:embed="rId25"/>
+                          <a:blip r:embed="rId20"/>
                           <a:stretch>
                             <a:fillRect/>
                           </a:stretch>
@@ -22823,18 +22792,18 @@
               <w:drawing>
                 <wp:inline distT="0" distR="0" distB="0" distL="0">
                   <wp:extent cx="203200" cy="177800"/>
-                  <wp:docPr id="28" name="Drawing 28" descr="file:/tmp/ViewElement__48qyMhVIEeetFdz5pzgWAw7857738189924401003.png"/>
+                  <wp:docPr id="23" name="Drawing 23" descr="file:/C:/Users/VINCEN~1/AppData/Local/Temp/ViewElement__48qyMhVIEeetFdz5pzgWAw15688383894392420815.png"/>
                   <a:graphic xmlns:a="http://schemas.openxmlformats.org/drawingml/2006/main">
                     <a:graphicData uri="http://schemas.openxmlformats.org/drawingml/2006/picture">
                       <pic:pic xmlns:pic="http://schemas.openxmlformats.org/drawingml/2006/picture">
                         <pic:nvPicPr>
-                          <pic:cNvPr id="0" name="Picture 28" descr="file:/tmp/ViewElement__48qyMhVIEeetFdz5pzgWAw7857738189924401003.png"/>
+                          <pic:cNvPr id="0" name="Picture 23" descr="file:/C:/Users/VINCEN~1/AppData/Local/Temp/ViewElement__48qyMhVIEeetFdz5pzgWAw15688383894392420815.png"/>
                           <pic:cNvPicPr>
                             <a:picLocks noChangeAspect="true"/>
                           </pic:cNvPicPr>
                         </pic:nvPicPr>
                         <pic:blipFill>
-                          <a:blip r:embed="rId24"/>
+                          <a:blip r:embed="rId19"/>
                           <a:stretch>
                             <a:fillRect/>
                           </a:stretch>
@@ -22883,18 +22852,18 @@
               <w:drawing>
                 <wp:inline distT="0" distR="0" distB="0" distL="0">
                   <wp:extent cx="203200" cy="190500"/>
-                  <wp:docPr id="29" name="Drawing 29" descr="file:/tmp/ViewElement__48qyNBVIEeetFdz5pzgWAw8526482828279546856.png"/>
+                  <wp:docPr id="24" name="Drawing 24" descr="file:/C:/Users/VINCEN~1/AppData/Local/Temp/ViewElement__48qyNBVIEeetFdz5pzgWAw11307542615053496388.png"/>
                   <a:graphic xmlns:a="http://schemas.openxmlformats.org/drawingml/2006/main">
                     <a:graphicData uri="http://schemas.openxmlformats.org/drawingml/2006/picture">
                       <pic:pic xmlns:pic="http://schemas.openxmlformats.org/drawingml/2006/picture">
                         <pic:nvPicPr>
-                          <pic:cNvPr id="0" name="Picture 29" descr="file:/tmp/ViewElement__48qyNBVIEeetFdz5pzgWAw8526482828279546856.png"/>
+                          <pic:cNvPr id="0" name="Picture 24" descr="file:/C:/Users/VINCEN~1/AppData/Local/Temp/ViewElement__48qyNBVIEeetFdz5pzgWAw11307542615053496388.png"/>
                           <pic:cNvPicPr>
                             <a:picLocks noChangeAspect="true"/>
                           </pic:cNvPicPr>
                         </pic:nvPicPr>
                         <pic:blipFill>
-                          <a:blip r:embed="rId26"/>
+                          <a:blip r:embed="rId21"/>
                           <a:stretch>
                             <a:fillRect/>
                           </a:stretch>
@@ -22943,18 +22912,18 @@
               <w:drawing>
                 <wp:inline distT="0" distR="0" distB="0" distL="0">
                   <wp:extent cx="203200" cy="190500"/>
-                  <wp:docPr id="30" name="Drawing 30" descr="file:/tmp/ViewElement__48qyOBVIEeetFdz5pzgWAw7350554893706284055.png"/>
+                  <wp:docPr id="25" name="Drawing 25" descr="file:/C:/Users/VINCEN~1/AppData/Local/Temp/ViewElement__48qyOBVIEeetFdz5pzgWAw14417471219330103695.png"/>
                   <a:graphic xmlns:a="http://schemas.openxmlformats.org/drawingml/2006/main">
                     <a:graphicData uri="http://schemas.openxmlformats.org/drawingml/2006/picture">
                       <pic:pic xmlns:pic="http://schemas.openxmlformats.org/drawingml/2006/picture">
                         <pic:nvPicPr>
-                          <pic:cNvPr id="0" name="Picture 30" descr="file:/tmp/ViewElement__48qyOBVIEeetFdz5pzgWAw7350554893706284055.png"/>
+                          <pic:cNvPr id="0" name="Picture 25" descr="file:/C:/Users/VINCEN~1/AppData/Local/Temp/ViewElement__48qyOBVIEeetFdz5pzgWAw14417471219330103695.png"/>
                           <pic:cNvPicPr>
                             <a:picLocks noChangeAspect="true"/>
                           </pic:cNvPicPr>
                         </pic:nvPicPr>
                         <pic:blipFill>
-                          <a:blip r:embed="rId26"/>
+                          <a:blip r:embed="rId21"/>
                           <a:stretch>
                             <a:fillRect/>
                           </a:stretch>
@@ -23050,12 +23019,12 @@
               <w:drawing>
                 <wp:inline distT="0" distR="0" distB="0" distL="0">
                   <wp:extent cx="203200" cy="203200"/>
-                  <wp:docPr id="31" name="Drawing 31" descr="file:/tmp/ViewContainer__48gaJBVIEeetFdz5pzgWAw4955847409721672845.png"/>
+                  <wp:docPr id="26" name="Drawing 26" descr="file:/C:/Users/VINCEN~1/AppData/Local/Temp/ViewContainer__48gaJBVIEeetFdz5pzgWAw8136501207718331239.png"/>
                   <a:graphic xmlns:a="http://schemas.openxmlformats.org/drawingml/2006/main">
                     <a:graphicData uri="http://schemas.openxmlformats.org/drawingml/2006/picture">
                       <pic:pic xmlns:pic="http://schemas.openxmlformats.org/drawingml/2006/picture">
                         <pic:nvPicPr>
-                          <pic:cNvPr id="0" name="Picture 31" descr="file:/tmp/ViewContainer__48gaJBVIEeetFdz5pzgWAw4955847409721672845.png"/>
+                          <pic:cNvPr id="0" name="Picture 26" descr="file:/C:/Users/VINCEN~1/AppData/Local/Temp/ViewContainer__48gaJBVIEeetFdz5pzgWAw8136501207718331239.png"/>
                           <pic:cNvPicPr>
                             <a:picLocks noChangeAspect="true"/>
                           </pic:cNvPicPr>
@@ -23110,12 +23079,12 @@
               <w:drawing>
                 <wp:inline distT="0" distR="0" distB="0" distL="0">
                   <wp:extent cx="203200" cy="203200"/>
-                  <wp:docPr id="32" name="Drawing 32" descr="file:/tmp/ViewContainer__48jdcBVIEeetFdz5pzgWAw2786862132433838512.png"/>
+                  <wp:docPr id="27" name="Drawing 27" descr="file:/C:/Users/VINCEN~1/AppData/Local/Temp/ViewContainer__48jdcBVIEeetFdz5pzgWAw9451745896632962501.png"/>
                   <a:graphic xmlns:a="http://schemas.openxmlformats.org/drawingml/2006/main">
                     <a:graphicData uri="http://schemas.openxmlformats.org/drawingml/2006/picture">
                       <pic:pic xmlns:pic="http://schemas.openxmlformats.org/drawingml/2006/picture">
                         <pic:nvPicPr>
-                          <pic:cNvPr id="0" name="Picture 32" descr="file:/tmp/ViewContainer__48jdcBVIEeetFdz5pzgWAw2786862132433838512.png"/>
+                          <pic:cNvPr id="0" name="Picture 27" descr="file:/C:/Users/VINCEN~1/AppData/Local/Temp/ViewContainer__48jdcBVIEeetFdz5pzgWAw9451745896632962501.png"/>
                           <pic:cNvPicPr>
                             <a:picLocks noChangeAspect="true"/>
                           </pic:cNvPicPr>
@@ -23170,12 +23139,12 @@
               <w:drawing>
                 <wp:inline distT="0" distR="0" distB="0" distL="0">
                   <wp:extent cx="203200" cy="203200"/>
-                  <wp:docPr id="33" name="Drawing 33" descr="file:/tmp/ViewContainer__48qLIBVIEeetFdz5pzgWAw5689440058726802599.png"/>
+                  <wp:docPr id="28" name="Drawing 28" descr="file:/C:/Users/VINCEN~1/AppData/Local/Temp/ViewContainer__48qLIBVIEeetFdz5pzgWAw8177898399281421889.png"/>
                   <a:graphic xmlns:a="http://schemas.openxmlformats.org/drawingml/2006/main">
                     <a:graphicData uri="http://schemas.openxmlformats.org/drawingml/2006/picture">
                       <pic:pic xmlns:pic="http://schemas.openxmlformats.org/drawingml/2006/picture">
                         <pic:nvPicPr>
-                          <pic:cNvPr id="0" name="Picture 33" descr="file:/tmp/ViewContainer__48qLIBVIEeetFdz5pzgWAw5689440058726802599.png"/>
+                          <pic:cNvPr id="0" name="Picture 28" descr="file:/C:/Users/VINCEN~1/AppData/Local/Temp/ViewContainer__48qLIBVIEeetFdz5pzgWAw8177898399281421889.png"/>
                           <pic:cNvPicPr>
                             <a:picLocks noChangeAspect="true"/>
                           </pic:cNvPicPr>
@@ -23230,12 +23199,12 @@
               <w:drawing>
                 <wp:inline distT="0" distR="0" distB="0" distL="0">
                   <wp:extent cx="203200" cy="203200"/>
-                  <wp:docPr id="34" name="Drawing 34" descr="file:/tmp/ViewContainer__48qLLxVIEeetFdz5pzgWAw3776599039484580170.png"/>
+                  <wp:docPr id="29" name="Drawing 29" descr="file:/C:/Users/VINCEN~1/AppData/Local/Temp/ViewContainer__48qLLxVIEeetFdz5pzgWAw911429958749661324.png"/>
                   <a:graphic xmlns:a="http://schemas.openxmlformats.org/drawingml/2006/main">
                     <a:graphicData uri="http://schemas.openxmlformats.org/drawingml/2006/picture">
                       <pic:pic xmlns:pic="http://schemas.openxmlformats.org/drawingml/2006/picture">
                         <pic:nvPicPr>
-                          <pic:cNvPr id="0" name="Picture 34" descr="file:/tmp/ViewContainer__48qLLxVIEeetFdz5pzgWAw3776599039484580170.png"/>
+                          <pic:cNvPr id="0" name="Picture 29" descr="file:/C:/Users/VINCEN~1/AppData/Local/Temp/ViewContainer__48qLLxVIEeetFdz5pzgWAw911429958749661324.png"/>
                           <pic:cNvPicPr>
                             <a:picLocks noChangeAspect="true"/>
                           </pic:cNvPicPr>
@@ -23290,18 +23259,18 @@
               <w:drawing>
                 <wp:inline distT="0" distR="0" distB="0" distL="0">
                   <wp:extent cx="203200" cy="177800"/>
-                  <wp:docPr id="35" name="Drawing 35" descr="file:/tmp/ViewElement__48qLLBVIEeetFdz5pzgWAw2435479564110338868.png"/>
+                  <wp:docPr id="30" name="Drawing 30" descr="file:/C:/Users/VINCEN~1/AppData/Local/Temp/ViewElement__48qLLBVIEeetFdz5pzgWAw17523572196600639357.png"/>
                   <a:graphic xmlns:a="http://schemas.openxmlformats.org/drawingml/2006/main">
                     <a:graphicData uri="http://schemas.openxmlformats.org/drawingml/2006/picture">
                       <pic:pic xmlns:pic="http://schemas.openxmlformats.org/drawingml/2006/picture">
                         <pic:nvPicPr>
-                          <pic:cNvPr id="0" name="Picture 35" descr="file:/tmp/ViewElement__48qLLBVIEeetFdz5pzgWAw2435479564110338868.png"/>
+                          <pic:cNvPr id="0" name="Picture 30" descr="file:/C:/Users/VINCEN~1/AppData/Local/Temp/ViewElement__48qLLBVIEeetFdz5pzgWAw17523572196600639357.png"/>
                           <pic:cNvPicPr>
                             <a:picLocks noChangeAspect="true"/>
                           </pic:cNvPicPr>
                         </pic:nvPicPr>
                         <pic:blipFill>
-                          <a:blip r:embed="rId23"/>
+                          <a:blip r:embed="rId18"/>
                           <a:stretch>
                             <a:fillRect/>
                           </a:stretch>
@@ -23397,12 +23366,12 @@
               <w:drawing>
                 <wp:inline distT="0" distR="0" distB="0" distL="0">
                   <wp:extent cx="203200" cy="203200"/>
-                  <wp:docPr id="36" name="Drawing 36" descr="file:/tmp/ViewContainer__48jdcBVIEeetFdz5pzgWAw11904403308819352786.png"/>
+                  <wp:docPr id="31" name="Drawing 31" descr="file:/C:/Users/VINCEN~1/AppData/Local/Temp/ViewContainer__48jdcBVIEeetFdz5pzgWAw5398124409893692820.png"/>
                   <a:graphic xmlns:a="http://schemas.openxmlformats.org/drawingml/2006/main">
                     <a:graphicData uri="http://schemas.openxmlformats.org/drawingml/2006/picture">
                       <pic:pic xmlns:pic="http://schemas.openxmlformats.org/drawingml/2006/picture">
                         <pic:nvPicPr>
-                          <pic:cNvPr id="0" name="Picture 36" descr="file:/tmp/ViewContainer__48jdcBVIEeetFdz5pzgWAw11904403308819352786.png"/>
+                          <pic:cNvPr id="0" name="Picture 31" descr="file:/C:/Users/VINCEN~1/AppData/Local/Temp/ViewContainer__48jdcBVIEeetFdz5pzgWAw5398124409893692820.png"/>
                           <pic:cNvPicPr>
                             <a:picLocks noChangeAspect="true"/>
                           </pic:cNvPicPr>
@@ -23457,18 +23426,18 @@
               <w:drawing>
                 <wp:inline distT="0" distR="0" distB="0" distL="0">
                   <wp:extent cx="203200" cy="190500"/>
-                  <wp:docPr id="37" name="Drawing 37" descr="file:/tmp/ViewElement__48jdchVIEeetFdz5pzgWAw15115315975661045202.png"/>
+                  <wp:docPr id="32" name="Drawing 32" descr="file:/C:/Users/VINCEN~1/AppData/Local/Temp/ViewElement__48jdchVIEeetFdz5pzgWAw11306554322723770269.png"/>
                   <a:graphic xmlns:a="http://schemas.openxmlformats.org/drawingml/2006/main">
                     <a:graphicData uri="http://schemas.openxmlformats.org/drawingml/2006/picture">
                       <pic:pic xmlns:pic="http://schemas.openxmlformats.org/drawingml/2006/picture">
                         <pic:nvPicPr>
-                          <pic:cNvPr id="0" name="Picture 37" descr="file:/tmp/ViewElement__48jdchVIEeetFdz5pzgWAw15115315975661045202.png"/>
+                          <pic:cNvPr id="0" name="Picture 32" descr="file:/C:/Users/VINCEN~1/AppData/Local/Temp/ViewElement__48jdchVIEeetFdz5pzgWAw11306554322723770269.png"/>
                           <pic:cNvPicPr>
                             <a:picLocks noChangeAspect="true"/>
                           </pic:cNvPicPr>
                         </pic:nvPicPr>
                         <pic:blipFill>
-                          <a:blip r:embed="rId27"/>
+                          <a:blip r:embed="rId22"/>
                           <a:stretch>
                             <a:fillRect/>
                           </a:stretch>
@@ -23517,18 +23486,18 @@
               <w:drawing>
                 <wp:inline distT="0" distR="0" distB="0" distL="0">
                   <wp:extent cx="203200" cy="190500"/>
-                  <wp:docPr id="38" name="Drawing 38" descr="file:/tmp/ViewElement__48jddBVIEeetFdz5pzgWAw9124664081706332563.png"/>
+                  <wp:docPr id="33" name="Drawing 33" descr="file:/C:/Users/VINCEN~1/AppData/Local/Temp/ViewElement__48jddBVIEeetFdz5pzgWAw17741285815466614934.png"/>
                   <a:graphic xmlns:a="http://schemas.openxmlformats.org/drawingml/2006/main">
                     <a:graphicData uri="http://schemas.openxmlformats.org/drawingml/2006/picture">
                       <pic:pic xmlns:pic="http://schemas.openxmlformats.org/drawingml/2006/picture">
                         <pic:nvPicPr>
-                          <pic:cNvPr id="0" name="Picture 38" descr="file:/tmp/ViewElement__48jddBVIEeetFdz5pzgWAw9124664081706332563.png"/>
+                          <pic:cNvPr id="0" name="Picture 33" descr="file:/C:/Users/VINCEN~1/AppData/Local/Temp/ViewElement__48jddBVIEeetFdz5pzgWAw17741285815466614934.png"/>
                           <pic:cNvPicPr>
                             <a:picLocks noChangeAspect="true"/>
                           </pic:cNvPicPr>
                         </pic:nvPicPr>
                         <pic:blipFill>
-                          <a:blip r:embed="rId27"/>
+                          <a:blip r:embed="rId22"/>
                           <a:stretch>
                             <a:fillRect/>
                           </a:stretch>
@@ -23577,18 +23546,18 @@
               <w:drawing>
                 <wp:inline distT="0" distR="0" distB="0" distL="0">
                   <wp:extent cx="203200" cy="177800"/>
-                  <wp:docPr id="39" name="Drawing 39" descr="file:/tmp/ViewElement__48jddhVIEeetFdz5pzgWAw8371723256273699260.png"/>
+                  <wp:docPr id="34" name="Drawing 34" descr="file:/C:/Users/VINCEN~1/AppData/Local/Temp/ViewElement__48jddhVIEeetFdz5pzgWAw7558871435204801229.png"/>
                   <a:graphic xmlns:a="http://schemas.openxmlformats.org/drawingml/2006/main">
                     <a:graphicData uri="http://schemas.openxmlformats.org/drawingml/2006/picture">
                       <pic:pic xmlns:pic="http://schemas.openxmlformats.org/drawingml/2006/picture">
                         <pic:nvPicPr>
-                          <pic:cNvPr id="0" name="Picture 39" descr="file:/tmp/ViewElement__48jddhVIEeetFdz5pzgWAw8371723256273699260.png"/>
+                          <pic:cNvPr id="0" name="Picture 34" descr="file:/C:/Users/VINCEN~1/AppData/Local/Temp/ViewElement__48jddhVIEeetFdz5pzgWAw7558871435204801229.png"/>
                           <pic:cNvPicPr>
                             <a:picLocks noChangeAspect="true"/>
                           </pic:cNvPicPr>
                         </pic:nvPicPr>
                         <pic:blipFill>
-                          <a:blip r:embed="rId24"/>
+                          <a:blip r:embed="rId19"/>
                           <a:stretch>
                             <a:fillRect/>
                           </a:stretch>
@@ -23637,18 +23606,18 @@
               <w:drawing>
                 <wp:inline distT="0" distR="0" distB="0" distL="0">
                   <wp:extent cx="203200" cy="190500"/>
-                  <wp:docPr id="40" name="Drawing 40" descr="file:/tmp/ViewElement__48jdeBVIEeetFdz5pzgWAw17601000385118820140.png"/>
+                  <wp:docPr id="35" name="Drawing 35" descr="file:/C:/Users/VINCEN~1/AppData/Local/Temp/ViewElement__48jdeBVIEeetFdz5pzgWAw5787580006073809339.png"/>
                   <a:graphic xmlns:a="http://schemas.openxmlformats.org/drawingml/2006/main">
                     <a:graphicData uri="http://schemas.openxmlformats.org/drawingml/2006/picture">
                       <pic:pic xmlns:pic="http://schemas.openxmlformats.org/drawingml/2006/picture">
                         <pic:nvPicPr>
-                          <pic:cNvPr id="0" name="Picture 40" descr="file:/tmp/ViewElement__48jdeBVIEeetFdz5pzgWAw17601000385118820140.png"/>
+                          <pic:cNvPr id="0" name="Picture 35" descr="file:/C:/Users/VINCEN~1/AppData/Local/Temp/ViewElement__48jdeBVIEeetFdz5pzgWAw5787580006073809339.png"/>
                           <pic:cNvPicPr>
                             <a:picLocks noChangeAspect="true"/>
                           </pic:cNvPicPr>
                         </pic:nvPicPr>
                         <pic:blipFill>
-                          <a:blip r:embed="rId26"/>
+                          <a:blip r:embed="rId21"/>
                           <a:stretch>
                             <a:fillRect/>
                           </a:stretch>
@@ -23744,12 +23713,12 @@
               <w:drawing>
                 <wp:inline distT="0" distR="0" distB="0" distL="0">
                   <wp:extent cx="203200" cy="203200"/>
-                  <wp:docPr id="41" name="Drawing 41" descr="file:/tmp/ViewContainer__48qLIBVIEeetFdz5pzgWAw12389570091919535173.png"/>
+                  <wp:docPr id="36" name="Drawing 36" descr="file:/C:/Users/VINCEN~1/AppData/Local/Temp/ViewContainer__48qLIBVIEeetFdz5pzgWAw2623153443488029747.png"/>
                   <a:graphic xmlns:a="http://schemas.openxmlformats.org/drawingml/2006/main">
                     <a:graphicData uri="http://schemas.openxmlformats.org/drawingml/2006/picture">
                       <pic:pic xmlns:pic="http://schemas.openxmlformats.org/drawingml/2006/picture">
                         <pic:nvPicPr>
-                          <pic:cNvPr id="0" name="Picture 41" descr="file:/tmp/ViewContainer__48qLIBVIEeetFdz5pzgWAw12389570091919535173.png"/>
+                          <pic:cNvPr id="0" name="Picture 36" descr="file:/C:/Users/VINCEN~1/AppData/Local/Temp/ViewContainer__48qLIBVIEeetFdz5pzgWAw2623153443488029747.png"/>
                           <pic:cNvPicPr>
                             <a:picLocks noChangeAspect="true"/>
                           </pic:cNvPicPr>
@@ -23804,18 +23773,18 @@
               <w:drawing>
                 <wp:inline distT="0" distR="0" distB="0" distL="0">
                   <wp:extent cx="203200" cy="190500"/>
-                  <wp:docPr id="42" name="Drawing 42" descr="file:/tmp/ViewElement__48qLIhVIEeetFdz5pzgWAw4876711506841308797.png"/>
+                  <wp:docPr id="37" name="Drawing 37" descr="file:/C:/Users/VINCEN~1/AppData/Local/Temp/ViewElement__48qLIhVIEeetFdz5pzgWAw17625115626185812966.png"/>
                   <a:graphic xmlns:a="http://schemas.openxmlformats.org/drawingml/2006/main">
                     <a:graphicData uri="http://schemas.openxmlformats.org/drawingml/2006/picture">
                       <pic:pic xmlns:pic="http://schemas.openxmlformats.org/drawingml/2006/picture">
                         <pic:nvPicPr>
-                          <pic:cNvPr id="0" name="Picture 42" descr="file:/tmp/ViewElement__48qLIhVIEeetFdz5pzgWAw4876711506841308797.png"/>
+                          <pic:cNvPr id="0" name="Picture 37" descr="file:/C:/Users/VINCEN~1/AppData/Local/Temp/ViewElement__48qLIhVIEeetFdz5pzgWAw17625115626185812966.png"/>
                           <pic:cNvPicPr>
                             <a:picLocks noChangeAspect="true"/>
                           </pic:cNvPicPr>
                         </pic:nvPicPr>
                         <pic:blipFill>
-                          <a:blip r:embed="rId28"/>
+                          <a:blip r:embed="rId23"/>
                           <a:stretch>
                             <a:fillRect/>
                           </a:stretch>
@@ -23864,18 +23833,18 @@
               <w:drawing>
                 <wp:inline distT="0" distR="0" distB="0" distL="0">
                   <wp:extent cx="203200" cy="190500"/>
-                  <wp:docPr id="43" name="Drawing 43" descr="file:/tmp/ViewElement__48qLJBVIEeetFdz5pzgWAw11365389658015402706.png"/>
+                  <wp:docPr id="38" name="Drawing 38" descr="file:/C:/Users/VINCEN~1/AppData/Local/Temp/ViewElement__48qLJBVIEeetFdz5pzgWAw8126371911161483418.png"/>
                   <a:graphic xmlns:a="http://schemas.openxmlformats.org/drawingml/2006/main">
                     <a:graphicData uri="http://schemas.openxmlformats.org/drawingml/2006/picture">
                       <pic:pic xmlns:pic="http://schemas.openxmlformats.org/drawingml/2006/picture">
                         <pic:nvPicPr>
-                          <pic:cNvPr id="0" name="Picture 43" descr="file:/tmp/ViewElement__48qLJBVIEeetFdz5pzgWAw11365389658015402706.png"/>
+                          <pic:cNvPr id="0" name="Picture 38" descr="file:/C:/Users/VINCEN~1/AppData/Local/Temp/ViewElement__48qLJBVIEeetFdz5pzgWAw8126371911161483418.png"/>
                           <pic:cNvPicPr>
                             <a:picLocks noChangeAspect="true"/>
                           </pic:cNvPicPr>
                         </pic:nvPicPr>
                         <pic:blipFill>
-                          <a:blip r:embed="rId29"/>
+                          <a:blip r:embed="rId24"/>
                           <a:stretch>
                             <a:fillRect/>
                           </a:stretch>
@@ -23924,18 +23893,18 @@
               <w:drawing>
                 <wp:inline distT="0" distR="0" distB="0" distL="0">
                   <wp:extent cx="203200" cy="190500"/>
-                  <wp:docPr id="44" name="Drawing 44" descr="file:/tmp/ViewElement__48qLJhVIEeetFdz5pzgWAw821557855510787712.png"/>
+                  <wp:docPr id="39" name="Drawing 39" descr="file:/C:/Users/VINCEN~1/AppData/Local/Temp/ViewElement__48qLJhVIEeetFdz5pzgWAw6225071724847549213.png"/>
                   <a:graphic xmlns:a="http://schemas.openxmlformats.org/drawingml/2006/main">
                     <a:graphicData uri="http://schemas.openxmlformats.org/drawingml/2006/picture">
                       <pic:pic xmlns:pic="http://schemas.openxmlformats.org/drawingml/2006/picture">
                         <pic:nvPicPr>
-                          <pic:cNvPr id="0" name="Picture 44" descr="file:/tmp/ViewElement__48qLJhVIEeetFdz5pzgWAw821557855510787712.png"/>
+                          <pic:cNvPr id="0" name="Picture 39" descr="file:/C:/Users/VINCEN~1/AppData/Local/Temp/ViewElement__48qLJhVIEeetFdz5pzgWAw6225071724847549213.png"/>
                           <pic:cNvPicPr>
                             <a:picLocks noChangeAspect="true"/>
                           </pic:cNvPicPr>
                         </pic:nvPicPr>
                         <pic:blipFill>
-                          <a:blip r:embed="rId29"/>
+                          <a:blip r:embed="rId24"/>
                           <a:stretch>
                             <a:fillRect/>
                           </a:stretch>
@@ -23984,18 +23953,18 @@
               <w:drawing>
                 <wp:inline distT="0" distR="0" distB="0" distL="0">
                   <wp:extent cx="203200" cy="177800"/>
-                  <wp:docPr id="45" name="Drawing 45" descr="file:/tmp/ViewElement__48qLKBVIEeetFdz5pzgWAw15470396449027975086.png"/>
+                  <wp:docPr id="40" name="Drawing 40" descr="file:/C:/Users/VINCEN~1/AppData/Local/Temp/ViewElement__48qLKBVIEeetFdz5pzgWAw18380302180486191697.png"/>
                   <a:graphic xmlns:a="http://schemas.openxmlformats.org/drawingml/2006/main">
                     <a:graphicData uri="http://schemas.openxmlformats.org/drawingml/2006/picture">
                       <pic:pic xmlns:pic="http://schemas.openxmlformats.org/drawingml/2006/picture">
                         <pic:nvPicPr>
-                          <pic:cNvPr id="0" name="Picture 45" descr="file:/tmp/ViewElement__48qLKBVIEeetFdz5pzgWAw15470396449027975086.png"/>
+                          <pic:cNvPr id="0" name="Picture 40" descr="file:/C:/Users/VINCEN~1/AppData/Local/Temp/ViewElement__48qLKBVIEeetFdz5pzgWAw18380302180486191697.png"/>
                           <pic:cNvPicPr>
                             <a:picLocks noChangeAspect="true"/>
                           </pic:cNvPicPr>
                         </pic:nvPicPr>
                         <pic:blipFill>
-                          <a:blip r:embed="rId23"/>
+                          <a:blip r:embed="rId18"/>
                           <a:stretch>
                             <a:fillRect/>
                           </a:stretch>
@@ -24091,12 +24060,12 @@
               <w:drawing>
                 <wp:inline distT="0" distR="0" distB="0" distL="0">
                   <wp:extent cx="203200" cy="203200"/>
-                  <wp:docPr id="46" name="Drawing 46" descr="file:/tmp/ViewContainer__48qLLxVIEeetFdz5pzgWAw1384555128335762404.png"/>
+                  <wp:docPr id="41" name="Drawing 41" descr="file:/C:/Users/VINCEN~1/AppData/Local/Temp/ViewContainer__48qLLxVIEeetFdz5pzgWAw10586867635694763721.png"/>
                   <a:graphic xmlns:a="http://schemas.openxmlformats.org/drawingml/2006/main">
                     <a:graphicData uri="http://schemas.openxmlformats.org/drawingml/2006/picture">
                       <pic:pic xmlns:pic="http://schemas.openxmlformats.org/drawingml/2006/picture">
                         <pic:nvPicPr>
-                          <pic:cNvPr id="0" name="Picture 46" descr="file:/tmp/ViewContainer__48qLLxVIEeetFdz5pzgWAw1384555128335762404.png"/>
+                          <pic:cNvPr id="0" name="Picture 41" descr="file:/C:/Users/VINCEN~1/AppData/Local/Temp/ViewContainer__48qLLxVIEeetFdz5pzgWAw10586867635694763721.png"/>
                           <pic:cNvPicPr>
                             <a:picLocks noChangeAspect="true"/>
                           </pic:cNvPicPr>
@@ -24151,12 +24120,12 @@
               <w:drawing>
                 <wp:inline distT="0" distR="0" distB="0" distL="0">
                   <wp:extent cx="203200" cy="203200"/>
-                  <wp:docPr id="47" name="Drawing 47" descr="file:/tmp/ViewContainer__48qLMRVIEeetFdz5pzgWAw5995480480664615876.png"/>
+                  <wp:docPr id="42" name="Drawing 42" descr="file:/C:/Users/VINCEN~1/AppData/Local/Temp/ViewContainer__48qLMRVIEeetFdz5pzgWAw7326515700709876152.png"/>
                   <a:graphic xmlns:a="http://schemas.openxmlformats.org/drawingml/2006/main">
                     <a:graphicData uri="http://schemas.openxmlformats.org/drawingml/2006/picture">
                       <pic:pic xmlns:pic="http://schemas.openxmlformats.org/drawingml/2006/picture">
                         <pic:nvPicPr>
-                          <pic:cNvPr id="0" name="Picture 47" descr="file:/tmp/ViewContainer__48qLMRVIEeetFdz5pzgWAw5995480480664615876.png"/>
+                          <pic:cNvPr id="0" name="Picture 42" descr="file:/C:/Users/VINCEN~1/AppData/Local/Temp/ViewContainer__48qLMRVIEeetFdz5pzgWAw7326515700709876152.png"/>
                           <pic:cNvPicPr>
                             <a:picLocks noChangeAspect="true"/>
                           </pic:cNvPicPr>
@@ -24211,18 +24180,18 @@
               <w:drawing>
                 <wp:inline distT="0" distR="0" distB="0" distL="0">
                   <wp:extent cx="203200" cy="190500"/>
-                  <wp:docPr id="48" name="Drawing 48" descr="file:/tmp/ViewElement__48qLPxVIEeetFdz5pzgWAw5098833784020403041.png"/>
+                  <wp:docPr id="43" name="Drawing 43" descr="file:/C:/Users/VINCEN~1/AppData/Local/Temp/ViewElement__48qLPxVIEeetFdz5pzgWAw17875988874022219637.png"/>
                   <a:graphic xmlns:a="http://schemas.openxmlformats.org/drawingml/2006/main">
                     <a:graphicData uri="http://schemas.openxmlformats.org/drawingml/2006/picture">
                       <pic:pic xmlns:pic="http://schemas.openxmlformats.org/drawingml/2006/picture">
                         <pic:nvPicPr>
-                          <pic:cNvPr id="0" name="Picture 48" descr="file:/tmp/ViewElement__48qLPxVIEeetFdz5pzgWAw5098833784020403041.png"/>
+                          <pic:cNvPr id="0" name="Picture 43" descr="file:/C:/Users/VINCEN~1/AppData/Local/Temp/ViewElement__48qLPxVIEeetFdz5pzgWAw17875988874022219637.png"/>
                           <pic:cNvPicPr>
                             <a:picLocks noChangeAspect="true"/>
                           </pic:cNvPicPr>
                         </pic:nvPicPr>
                         <pic:blipFill>
-                          <a:blip r:embed="rId26"/>
+                          <a:blip r:embed="rId21"/>
                           <a:stretch>
                             <a:fillRect/>
                           </a:stretch>
@@ -24318,12 +24287,12 @@
               <w:drawing>
                 <wp:inline distT="0" distR="0" distB="0" distL="0">
                   <wp:extent cx="203200" cy="203200"/>
-                  <wp:docPr id="49" name="Drawing 49" descr="file:/tmp/ViewContainer__48qLMRVIEeetFdz5pzgWAw17635141302440091888.png"/>
+                  <wp:docPr id="44" name="Drawing 44" descr="file:/C:/Users/VINCEN~1/AppData/Local/Temp/ViewContainer__48qLMRVIEeetFdz5pzgWAw12967970804521898239.png"/>
                   <a:graphic xmlns:a="http://schemas.openxmlformats.org/drawingml/2006/main">
                     <a:graphicData uri="http://schemas.openxmlformats.org/drawingml/2006/picture">
                       <pic:pic xmlns:pic="http://schemas.openxmlformats.org/drawingml/2006/picture">
                         <pic:nvPicPr>
-                          <pic:cNvPr id="0" name="Picture 49" descr="file:/tmp/ViewContainer__48qLMRVIEeetFdz5pzgWAw17635141302440091888.png"/>
+                          <pic:cNvPr id="0" name="Picture 44" descr="file:/C:/Users/VINCEN~1/AppData/Local/Temp/ViewContainer__48qLMRVIEeetFdz5pzgWAw12967970804521898239.png"/>
                           <pic:cNvPicPr>
                             <a:picLocks noChangeAspect="true"/>
                           </pic:cNvPicPr>
@@ -24378,18 +24347,18 @@
               <w:drawing>
                 <wp:inline distT="0" distR="0" distB="0" distL="0">
                   <wp:extent cx="203200" cy="190500"/>
-                  <wp:docPr id="50" name="Drawing 50" descr="file:/tmp/ViewElement__48qLMxVIEeetFdz5pzgWAw16434290599648923074.png"/>
+                  <wp:docPr id="45" name="Drawing 45" descr="file:/C:/Users/VINCEN~1/AppData/Local/Temp/ViewElement__48qLMxVIEeetFdz5pzgWAw1070282672316955096.png"/>
                   <a:graphic xmlns:a="http://schemas.openxmlformats.org/drawingml/2006/main">
                     <a:graphicData uri="http://schemas.openxmlformats.org/drawingml/2006/picture">
                       <pic:pic xmlns:pic="http://schemas.openxmlformats.org/drawingml/2006/picture">
                         <pic:nvPicPr>
-                          <pic:cNvPr id="0" name="Picture 50" descr="file:/tmp/ViewElement__48qLMxVIEeetFdz5pzgWAw16434290599648923074.png"/>
+                          <pic:cNvPr id="0" name="Picture 45" descr="file:/C:/Users/VINCEN~1/AppData/Local/Temp/ViewElement__48qLMxVIEeetFdz5pzgWAw1070282672316955096.png"/>
                           <pic:cNvPicPr>
                             <a:picLocks noChangeAspect="true"/>
                           </pic:cNvPicPr>
                         </pic:nvPicPr>
                         <pic:blipFill>
-                          <a:blip r:embed="rId29"/>
+                          <a:blip r:embed="rId24"/>
                           <a:stretch>
                             <a:fillRect/>
                           </a:stretch>
@@ -24438,18 +24407,18 @@
               <w:drawing>
                 <wp:inline distT="0" distR="0" distB="0" distL="0">
                   <wp:extent cx="203200" cy="190500"/>
-                  <wp:docPr id="51" name="Drawing 51" descr="file:/tmp/ViewElement__48qLNRVIEeetFdz5pzgWAw17057361181224538979.png"/>
+                  <wp:docPr id="46" name="Drawing 46" descr="file:/C:/Users/VINCEN~1/AppData/Local/Temp/ViewElement__48qLNRVIEeetFdz5pzgWAw796855607344752512.png"/>
                   <a:graphic xmlns:a="http://schemas.openxmlformats.org/drawingml/2006/main">
                     <a:graphicData uri="http://schemas.openxmlformats.org/drawingml/2006/picture">
                       <pic:pic xmlns:pic="http://schemas.openxmlformats.org/drawingml/2006/picture">
                         <pic:nvPicPr>
-                          <pic:cNvPr id="0" name="Picture 51" descr="file:/tmp/ViewElement__48qLNRVIEeetFdz5pzgWAw17057361181224538979.png"/>
+                          <pic:cNvPr id="0" name="Picture 46" descr="file:/C:/Users/VINCEN~1/AppData/Local/Temp/ViewElement__48qLNRVIEeetFdz5pzgWAw796855607344752512.png"/>
                           <pic:cNvPicPr>
                             <a:picLocks noChangeAspect="true"/>
                           </pic:cNvPicPr>
                         </pic:nvPicPr>
                         <pic:blipFill>
-                          <a:blip r:embed="rId29"/>
+                          <a:blip r:embed="rId24"/>
                           <a:stretch>
                             <a:fillRect/>
                           </a:stretch>
@@ -24498,18 +24467,18 @@
               <w:drawing>
                 <wp:inline distT="0" distR="0" distB="0" distL="0">
                   <wp:extent cx="203200" cy="190500"/>
-                  <wp:docPr id="52" name="Drawing 52" descr="file:/tmp/ViewElement__48qLNxVIEeetFdz5pzgWAw7967188688832488828.png"/>
+                  <wp:docPr id="47" name="Drawing 47" descr="file:/C:/Users/VINCEN~1/AppData/Local/Temp/ViewElement__48qLNxVIEeetFdz5pzgWAw3651280790127924337.png"/>
                   <a:graphic xmlns:a="http://schemas.openxmlformats.org/drawingml/2006/main">
                     <a:graphicData uri="http://schemas.openxmlformats.org/drawingml/2006/picture">
                       <pic:pic xmlns:pic="http://schemas.openxmlformats.org/drawingml/2006/picture">
                         <pic:nvPicPr>
-                          <pic:cNvPr id="0" name="Picture 52" descr="file:/tmp/ViewElement__48qLNxVIEeetFdz5pzgWAw7967188688832488828.png"/>
+                          <pic:cNvPr id="0" name="Picture 47" descr="file:/C:/Users/VINCEN~1/AppData/Local/Temp/ViewElement__48qLNxVIEeetFdz5pzgWAw3651280790127924337.png"/>
                           <pic:cNvPicPr>
                             <a:picLocks noChangeAspect="true"/>
                           </pic:cNvPicPr>
                         </pic:nvPicPr>
                         <pic:blipFill>
-                          <a:blip r:embed="rId29"/>
+                          <a:blip r:embed="rId24"/>
                           <a:stretch>
                             <a:fillRect/>
                           </a:stretch>
@@ -24558,18 +24527,18 @@
               <w:drawing>
                 <wp:inline distT="0" distR="0" distB="0" distL="0">
                   <wp:extent cx="203200" cy="177800"/>
-                  <wp:docPr id="53" name="Drawing 53" descr="file:/tmp/ViewElement__48qLORVIEeetFdz5pzgWAw15895339844584063153.png"/>
+                  <wp:docPr id="48" name="Drawing 48" descr="file:/C:/Users/VINCEN~1/AppData/Local/Temp/ViewElement__48qLORVIEeetFdz5pzgWAw12082403621605965973.png"/>
                   <a:graphic xmlns:a="http://schemas.openxmlformats.org/drawingml/2006/main">
                     <a:graphicData uri="http://schemas.openxmlformats.org/drawingml/2006/picture">
                       <pic:pic xmlns:pic="http://schemas.openxmlformats.org/drawingml/2006/picture">
                         <pic:nvPicPr>
-                          <pic:cNvPr id="0" name="Picture 53" descr="file:/tmp/ViewElement__48qLORVIEeetFdz5pzgWAw15895339844584063153.png"/>
+                          <pic:cNvPr id="0" name="Picture 48" descr="file:/C:/Users/VINCEN~1/AppData/Local/Temp/ViewElement__48qLORVIEeetFdz5pzgWAw12082403621605965973.png"/>
                           <pic:cNvPicPr>
                             <a:picLocks noChangeAspect="true"/>
                           </pic:cNvPicPr>
                         </pic:nvPicPr>
                         <pic:blipFill>
-                          <a:blip r:embed="rId24"/>
+                          <a:blip r:embed="rId19"/>
                           <a:stretch>
                             <a:fillRect/>
                           </a:stretch>
@@ -24618,18 +24587,18 @@
               <w:drawing>
                 <wp:inline distT="0" distR="0" distB="0" distL="0">
                   <wp:extent cx="203200" cy="190500"/>
-                  <wp:docPr id="54" name="Drawing 54" descr="file:/tmp/ViewElement__48qLOxVIEeetFdz5pzgWAw11068827040834006870.png"/>
+                  <wp:docPr id="49" name="Drawing 49" descr="file:/C:/Users/VINCEN~1/AppData/Local/Temp/ViewElement__48qLOxVIEeetFdz5pzgWAw9027128966252567820.png"/>
                   <a:graphic xmlns:a="http://schemas.openxmlformats.org/drawingml/2006/main">
                     <a:graphicData uri="http://schemas.openxmlformats.org/drawingml/2006/picture">
                       <pic:pic xmlns:pic="http://schemas.openxmlformats.org/drawingml/2006/picture">
                         <pic:nvPicPr>
-                          <pic:cNvPr id="0" name="Picture 54" descr="file:/tmp/ViewElement__48qLOxVIEeetFdz5pzgWAw11068827040834006870.png"/>
+                          <pic:cNvPr id="0" name="Picture 49" descr="file:/C:/Users/VINCEN~1/AppData/Local/Temp/ViewElement__48qLOxVIEeetFdz5pzgWAw9027128966252567820.png"/>
                           <pic:cNvPicPr>
                             <a:picLocks noChangeAspect="true"/>
                           </pic:cNvPicPr>
                         </pic:nvPicPr>
                         <pic:blipFill>
-                          <a:blip r:embed="rId26"/>
+                          <a:blip r:embed="rId21"/>
                           <a:stretch>
                             <a:fillRect/>
                           </a:stretch>
@@ -24725,12 +24694,12 @@
               <w:drawing>
                 <wp:inline distT="0" distR="0" distB="0" distL="0">
                   <wp:extent cx="203200" cy="203200"/>
-                  <wp:docPr id="55" name="Drawing 55" descr="file:/tmp/ViewContainer__48qLRRVIEeetFdz5pzgWAw13785509907599647283.png"/>
+                  <wp:docPr id="50" name="Drawing 50" descr="file:/C:/Users/VINCEN~1/AppData/Local/Temp/ViewContainer__48qLRRVIEeetFdz5pzgWAw2295811520318539862.png"/>
                   <a:graphic xmlns:a="http://schemas.openxmlformats.org/drawingml/2006/main">
                     <a:graphicData uri="http://schemas.openxmlformats.org/drawingml/2006/picture">
                       <pic:pic xmlns:pic="http://schemas.openxmlformats.org/drawingml/2006/picture">
                         <pic:nvPicPr>
-                          <pic:cNvPr id="0" name="Picture 55" descr="file:/tmp/ViewContainer__48qLRRVIEeetFdz5pzgWAw13785509907599647283.png"/>
+                          <pic:cNvPr id="0" name="Picture 50" descr="file:/C:/Users/VINCEN~1/AppData/Local/Temp/ViewContainer__48qLRRVIEeetFdz5pzgWAw2295811520318539862.png"/>
                           <pic:cNvPicPr>
                             <a:picLocks noChangeAspect="true"/>
                           </pic:cNvPicPr>
@@ -24785,18 +24754,18 @@
               <w:drawing>
                 <wp:inline distT="0" distR="0" distB="0" distL="0">
                   <wp:extent cx="203200" cy="177800"/>
-                  <wp:docPr id="56" name="Drawing 56" descr="file:/tmp/ViewElement__48qLRxVIEeetFdz5pzgWAw17922335395346809387.png"/>
+                  <wp:docPr id="51" name="Drawing 51" descr="file:/C:/Users/VINCEN~1/AppData/Local/Temp/ViewElement__48qLRxVIEeetFdz5pzgWAw5788261605844755179.png"/>
                   <a:graphic xmlns:a="http://schemas.openxmlformats.org/drawingml/2006/main">
                     <a:graphicData uri="http://schemas.openxmlformats.org/drawingml/2006/picture">
                       <pic:pic xmlns:pic="http://schemas.openxmlformats.org/drawingml/2006/picture">
                         <pic:nvPicPr>
-                          <pic:cNvPr id="0" name="Picture 56" descr="file:/tmp/ViewElement__48qLRxVIEeetFdz5pzgWAw17922335395346809387.png"/>
+                          <pic:cNvPr id="0" name="Picture 51" descr="file:/C:/Users/VINCEN~1/AppData/Local/Temp/ViewElement__48qLRxVIEeetFdz5pzgWAw5788261605844755179.png"/>
                           <pic:cNvPicPr>
                             <a:picLocks noChangeAspect="true"/>
                           </pic:cNvPicPr>
                         </pic:nvPicPr>
                         <pic:blipFill>
-                          <a:blip r:embed="rId24"/>
+                          <a:blip r:embed="rId19"/>
                           <a:stretch>
                             <a:fillRect/>
                           </a:stretch>
@@ -24845,18 +24814,18 @@
               <w:drawing>
                 <wp:inline distT="0" distR="0" distB="0" distL="0">
                   <wp:extent cx="203200" cy="203200"/>
-                  <wp:docPr id="57" name="Drawing 57" descr="file:/tmp/ViewElement__48qyMBVIEeetFdz5pzgWAw10453185680176944197.png"/>
+                  <wp:docPr id="52" name="Drawing 52" descr="file:/C:/Users/VINCEN~1/AppData/Local/Temp/ViewElement__48qyMBVIEeetFdz5pzgWAw9561635601707273269.png"/>
                   <a:graphic xmlns:a="http://schemas.openxmlformats.org/drawingml/2006/main">
                     <a:graphicData uri="http://schemas.openxmlformats.org/drawingml/2006/picture">
                       <pic:pic xmlns:pic="http://schemas.openxmlformats.org/drawingml/2006/picture">
                         <pic:nvPicPr>
-                          <pic:cNvPr id="0" name="Picture 57" descr="file:/tmp/ViewElement__48qyMBVIEeetFdz5pzgWAw10453185680176944197.png"/>
+                          <pic:cNvPr id="0" name="Picture 52" descr="file:/C:/Users/VINCEN~1/AppData/Local/Temp/ViewElement__48qyMBVIEeetFdz5pzgWAw9561635601707273269.png"/>
                           <pic:cNvPicPr>
                             <a:picLocks noChangeAspect="true"/>
                           </pic:cNvPicPr>
                         </pic:nvPicPr>
                         <pic:blipFill>
-                          <a:blip r:embed="rId25"/>
+                          <a:blip r:embed="rId20"/>
                           <a:stretch>
                             <a:fillRect/>
                           </a:stretch>
@@ -24905,18 +24874,18 @@
               <w:drawing>
                 <wp:inline distT="0" distR="0" distB="0" distL="0">
                   <wp:extent cx="203200" cy="177800"/>
-                  <wp:docPr id="58" name="Drawing 58" descr="file:/tmp/ViewElement__48qyMhVIEeetFdz5pzgWAw13404298959776520642.png"/>
+                  <wp:docPr id="53" name="Drawing 53" descr="file:/C:/Users/VINCEN~1/AppData/Local/Temp/ViewElement__48qyMhVIEeetFdz5pzgWAw8179573361236275542.png"/>
                   <a:graphic xmlns:a="http://schemas.openxmlformats.org/drawingml/2006/main">
                     <a:graphicData uri="http://schemas.openxmlformats.org/drawingml/2006/picture">
                       <pic:pic xmlns:pic="http://schemas.openxmlformats.org/drawingml/2006/picture">
                         <pic:nvPicPr>
-                          <pic:cNvPr id="0" name="Picture 58" descr="file:/tmp/ViewElement__48qyMhVIEeetFdz5pzgWAw13404298959776520642.png"/>
+                          <pic:cNvPr id="0" name="Picture 53" descr="file:/C:/Users/VINCEN~1/AppData/Local/Temp/ViewElement__48qyMhVIEeetFdz5pzgWAw8179573361236275542.png"/>
                           <pic:cNvPicPr>
                             <a:picLocks noChangeAspect="true"/>
                           </pic:cNvPicPr>
                         </pic:nvPicPr>
                         <pic:blipFill>
-                          <a:blip r:embed="rId24"/>
+                          <a:blip r:embed="rId19"/>
                           <a:stretch>
                             <a:fillRect/>
                           </a:stretch>
@@ -24965,18 +24934,18 @@
               <w:drawing>
                 <wp:inline distT="0" distR="0" distB="0" distL="0">
                   <wp:extent cx="203200" cy="190500"/>
-                  <wp:docPr id="59" name="Drawing 59" descr="file:/tmp/ViewElement__48qyNBVIEeetFdz5pzgWAw17895150871195425333.png"/>
+                  <wp:docPr id="54" name="Drawing 54" descr="file:/C:/Users/VINCEN~1/AppData/Local/Temp/ViewElement__48qyNBVIEeetFdz5pzgWAw10366667165075130197.png"/>
                   <a:graphic xmlns:a="http://schemas.openxmlformats.org/drawingml/2006/main">
                     <a:graphicData uri="http://schemas.openxmlformats.org/drawingml/2006/picture">
                       <pic:pic xmlns:pic="http://schemas.openxmlformats.org/drawingml/2006/picture">
                         <pic:nvPicPr>
-                          <pic:cNvPr id="0" name="Picture 59" descr="file:/tmp/ViewElement__48qyNBVIEeetFdz5pzgWAw17895150871195425333.png"/>
+                          <pic:cNvPr id="0" name="Picture 54" descr="file:/C:/Users/VINCEN~1/AppData/Local/Temp/ViewElement__48qyNBVIEeetFdz5pzgWAw10366667165075130197.png"/>
                           <pic:cNvPicPr>
                             <a:picLocks noChangeAspect="true"/>
                           </pic:cNvPicPr>
                         </pic:nvPicPr>
                         <pic:blipFill>
-                          <a:blip r:embed="rId26"/>
+                          <a:blip r:embed="rId21"/>
                           <a:stretch>
                             <a:fillRect/>
                           </a:stretch>
@@ -25025,18 +24994,18 @@
               <w:drawing>
                 <wp:inline distT="0" distR="0" distB="0" distL="0">
                   <wp:extent cx="203200" cy="190500"/>
-                  <wp:docPr id="60" name="Drawing 60" descr="file:/tmp/ViewElement__48qyOBVIEeetFdz5pzgWAw14925693430866677016.png"/>
+                  <wp:docPr id="55" name="Drawing 55" descr="file:/C:/Users/VINCEN~1/AppData/Local/Temp/ViewElement__48qyOBVIEeetFdz5pzgWAw2601195306754042023.png"/>
                   <a:graphic xmlns:a="http://schemas.openxmlformats.org/drawingml/2006/main">
                     <a:graphicData uri="http://schemas.openxmlformats.org/drawingml/2006/picture">
                       <pic:pic xmlns:pic="http://schemas.openxmlformats.org/drawingml/2006/picture">
                         <pic:nvPicPr>
-                          <pic:cNvPr id="0" name="Picture 60" descr="file:/tmp/ViewElement__48qyOBVIEeetFdz5pzgWAw14925693430866677016.png"/>
+                          <pic:cNvPr id="0" name="Picture 55" descr="file:/C:/Users/VINCEN~1/AppData/Local/Temp/ViewElement__48qyOBVIEeetFdz5pzgWAw2601195306754042023.png"/>
                           <pic:cNvPicPr>
                             <a:picLocks noChangeAspect="true"/>
                           </pic:cNvPicPr>
                         </pic:nvPicPr>
                         <pic:blipFill>
-                          <a:blip r:embed="rId26"/>
+                          <a:blip r:embed="rId21"/>
                           <a:stretch>
                             <a:fillRect/>
                           </a:stretch>
@@ -25132,12 +25101,12 @@
               <w:drawing>
                 <wp:inline distT="0" distR="0" distB="0" distL="0">
                   <wp:extent cx="203200" cy="203200"/>
-                  <wp:docPr id="61" name="Drawing 61" descr="file:/tmp/ViewContainer__48vDrhVIEeetFdz5pzgWAw9355452468413700180.png"/>
+                  <wp:docPr id="56" name="Drawing 56" descr="file:/C:/Users/VINCEN~1/AppData/Local/Temp/ViewContainer__48vDrhVIEeetFdz5pzgWAw8771244444742892220.png"/>
                   <a:graphic xmlns:a="http://schemas.openxmlformats.org/drawingml/2006/main">
                     <a:graphicData uri="http://schemas.openxmlformats.org/drawingml/2006/picture">
                       <pic:pic xmlns:pic="http://schemas.openxmlformats.org/drawingml/2006/picture">
                         <pic:nvPicPr>
-                          <pic:cNvPr id="0" name="Picture 61" descr="file:/tmp/ViewContainer__48vDrhVIEeetFdz5pzgWAw9355452468413700180.png"/>
+                          <pic:cNvPr id="0" name="Picture 56" descr="file:/C:/Users/VINCEN~1/AppData/Local/Temp/ViewContainer__48vDrhVIEeetFdz5pzgWAw8771244444742892220.png"/>
                           <pic:cNvPicPr>
                             <a:picLocks noChangeAspect="true"/>
                           </pic:cNvPicPr>
@@ -25192,18 +25161,18 @@
               <w:drawing>
                 <wp:inline distT="0" distR="0" distB="0" distL="0">
                   <wp:extent cx="203200" cy="177800"/>
-                  <wp:docPr id="62" name="Drawing 62" descr="file:/tmp/ViewElement__48vDsBVIEeetFdz5pzgWAw6749632363422228398.png"/>
+                  <wp:docPr id="57" name="Drawing 57" descr="file:/C:/Users/VINCEN~1/AppData/Local/Temp/ViewElement__48vDsBVIEeetFdz5pzgWAw13109597577970311754.png"/>
                   <a:graphic xmlns:a="http://schemas.openxmlformats.org/drawingml/2006/main">
                     <a:graphicData uri="http://schemas.openxmlformats.org/drawingml/2006/picture">
                       <pic:pic xmlns:pic="http://schemas.openxmlformats.org/drawingml/2006/picture">
                         <pic:nvPicPr>
-                          <pic:cNvPr id="0" name="Picture 62" descr="file:/tmp/ViewElement__48vDsBVIEeetFdz5pzgWAw6749632363422228398.png"/>
+                          <pic:cNvPr id="0" name="Picture 57" descr="file:/C:/Users/VINCEN~1/AppData/Local/Temp/ViewElement__48vDsBVIEeetFdz5pzgWAw13109597577970311754.png"/>
                           <pic:cNvPicPr>
                             <a:picLocks noChangeAspect="true"/>
                           </pic:cNvPicPr>
                         </pic:nvPicPr>
                         <pic:blipFill>
-                          <a:blip r:embed="rId24"/>
+                          <a:blip r:embed="rId19"/>
                           <a:stretch>
                             <a:fillRect/>
                           </a:stretch>
@@ -25252,18 +25221,18 @@
               <w:drawing>
                 <wp:inline distT="0" distR="0" distB="0" distL="0">
                   <wp:extent cx="203200" cy="203200"/>
-                  <wp:docPr id="63" name="Drawing 63" descr="file:/tmp/ViewElement__48vDshVIEeetFdz5pzgWAw14647829853575218540.png"/>
+                  <wp:docPr id="58" name="Drawing 58" descr="file:/C:/Users/VINCEN~1/AppData/Local/Temp/ViewElement__48vDshVIEeetFdz5pzgWAw11372381564055290243.png"/>
                   <a:graphic xmlns:a="http://schemas.openxmlformats.org/drawingml/2006/main">
                     <a:graphicData uri="http://schemas.openxmlformats.org/drawingml/2006/picture">
                       <pic:pic xmlns:pic="http://schemas.openxmlformats.org/drawingml/2006/picture">
                         <pic:nvPicPr>
-                          <pic:cNvPr id="0" name="Picture 63" descr="file:/tmp/ViewElement__48vDshVIEeetFdz5pzgWAw14647829853575218540.png"/>
+                          <pic:cNvPr id="0" name="Picture 58" descr="file:/C:/Users/VINCEN~1/AppData/Local/Temp/ViewElement__48vDshVIEeetFdz5pzgWAw11372381564055290243.png"/>
                           <pic:cNvPicPr>
                             <a:picLocks noChangeAspect="true"/>
                           </pic:cNvPicPr>
                         </pic:nvPicPr>
                         <pic:blipFill>
-                          <a:blip r:embed="rId25"/>
+                          <a:blip r:embed="rId20"/>
                           <a:stretch>
                             <a:fillRect/>
                           </a:stretch>
@@ -25312,18 +25281,18 @@
               <w:drawing>
                 <wp:inline distT="0" distR="0" distB="0" distL="0">
                   <wp:extent cx="203200" cy="190500"/>
-                  <wp:docPr id="64" name="Drawing 64" descr="file:/tmp/ViewElement__48vDtBVIEeetFdz5pzgWAw11401645151138966564.png"/>
+                  <wp:docPr id="59" name="Drawing 59" descr="file:/C:/Users/VINCEN~1/AppData/Local/Temp/ViewElement__48vDtBVIEeetFdz5pzgWAw163370975141173561.png"/>
                   <a:graphic xmlns:a="http://schemas.openxmlformats.org/drawingml/2006/main">
                     <a:graphicData uri="http://schemas.openxmlformats.org/drawingml/2006/picture">
                       <pic:pic xmlns:pic="http://schemas.openxmlformats.org/drawingml/2006/picture">
                         <pic:nvPicPr>
-                          <pic:cNvPr id="0" name="Picture 64" descr="file:/tmp/ViewElement__48vDtBVIEeetFdz5pzgWAw11401645151138966564.png"/>
+                          <pic:cNvPr id="0" name="Picture 59" descr="file:/C:/Users/VINCEN~1/AppData/Local/Temp/ViewElement__48vDtBVIEeetFdz5pzgWAw163370975141173561.png"/>
                           <pic:cNvPicPr>
                             <a:picLocks noChangeAspect="true"/>
                           </pic:cNvPicPr>
                         </pic:nvPicPr>
                         <pic:blipFill>
-                          <a:blip r:embed="rId26"/>
+                          <a:blip r:embed="rId21"/>
                           <a:stretch>
                             <a:fillRect/>
                           </a:stretch>
@@ -25372,18 +25341,18 @@
               <w:drawing>
                 <wp:inline distT="0" distR="0" distB="0" distL="0">
                   <wp:extent cx="203200" cy="190500"/>
-                  <wp:docPr id="65" name="Drawing 65" descr="file:/tmp/ViewElement__48vDuBVIEeetFdz5pzgWAw10301766309436710385.png"/>
+                  <wp:docPr id="60" name="Drawing 60" descr="file:/C:/Users/VINCEN~1/AppData/Local/Temp/ViewElement__48vDuBVIEeetFdz5pzgWAw6876924818130254397.png"/>
                   <a:graphic xmlns:a="http://schemas.openxmlformats.org/drawingml/2006/main">
                     <a:graphicData uri="http://schemas.openxmlformats.org/drawingml/2006/picture">
                       <pic:pic xmlns:pic="http://schemas.openxmlformats.org/drawingml/2006/picture">
                         <pic:nvPicPr>
-                          <pic:cNvPr id="0" name="Picture 65" descr="file:/tmp/ViewElement__48vDuBVIEeetFdz5pzgWAw10301766309436710385.png"/>
+                          <pic:cNvPr id="0" name="Picture 60" descr="file:/C:/Users/VINCEN~1/AppData/Local/Temp/ViewElement__48vDuBVIEeetFdz5pzgWAw6876924818130254397.png"/>
                           <pic:cNvPicPr>
                             <a:picLocks noChangeAspect="true"/>
                           </pic:cNvPicPr>
                         </pic:nvPicPr>
                         <pic:blipFill>
-                          <a:blip r:embed="rId26"/>
+                          <a:blip r:embed="rId21"/>
                           <a:stretch>
                             <a:fillRect/>
                           </a:stretch>
@@ -25432,18 +25401,18 @@
               <w:drawing>
                 <wp:inline distT="0" distR="0" distB="0" distL="0">
                   <wp:extent cx="203200" cy="177800"/>
-                  <wp:docPr id="66" name="Drawing 66" descr="file:/tmp/ViewElement__48vDvBVIEeetFdz5pzgWAw12923759806285109238.png"/>
+                  <wp:docPr id="61" name="Drawing 61" descr="file:/C:/Users/VINCEN~1/AppData/Local/Temp/ViewElement__48vDvBVIEeetFdz5pzgWAw6383563149639114845.png"/>
                   <a:graphic xmlns:a="http://schemas.openxmlformats.org/drawingml/2006/main">
                     <a:graphicData uri="http://schemas.openxmlformats.org/drawingml/2006/picture">
                       <pic:pic xmlns:pic="http://schemas.openxmlformats.org/drawingml/2006/picture">
                         <pic:nvPicPr>
-                          <pic:cNvPr id="0" name="Picture 66" descr="file:/tmp/ViewElement__48vDvBVIEeetFdz5pzgWAw12923759806285109238.png"/>
+                          <pic:cNvPr id="0" name="Picture 61" descr="file:/C:/Users/VINCEN~1/AppData/Local/Temp/ViewElement__48vDvBVIEeetFdz5pzgWAw6383563149639114845.png"/>
                           <pic:cNvPicPr>
                             <a:picLocks noChangeAspect="true"/>
                           </pic:cNvPicPr>
                         </pic:nvPicPr>
                         <pic:blipFill>
-                          <a:blip r:embed="rId23"/>
+                          <a:blip r:embed="rId18"/>
                           <a:stretch>
                             <a:fillRect/>
                           </a:stretch>
@@ -25539,12 +25508,12 @@
               <w:drawing>
                 <wp:inline distT="0" distR="0" distB="0" distL="0">
                   <wp:extent cx="203200" cy="203200"/>
-                  <wp:docPr id="67" name="Drawing 67" descr="file:/tmp/ViewContainer__48vDwBVIEeetFdz5pzgWAw12592397758674036829.png"/>
+                  <wp:docPr id="62" name="Drawing 62" descr="file:/C:/Users/VINCEN~1/AppData/Local/Temp/ViewContainer__48vDwBVIEeetFdz5pzgWAw10769841857637135863.png"/>
                   <a:graphic xmlns:a="http://schemas.openxmlformats.org/drawingml/2006/main">
                     <a:graphicData uri="http://schemas.openxmlformats.org/drawingml/2006/picture">
                       <pic:pic xmlns:pic="http://schemas.openxmlformats.org/drawingml/2006/picture">
                         <pic:nvPicPr>
-                          <pic:cNvPr id="0" name="Picture 67" descr="file:/tmp/ViewContainer__48vDwBVIEeetFdz5pzgWAw12592397758674036829.png"/>
+                          <pic:cNvPr id="0" name="Picture 62" descr="file:/C:/Users/VINCEN~1/AppData/Local/Temp/ViewContainer__48vDwBVIEeetFdz5pzgWAw10769841857637135863.png"/>
                           <pic:cNvPicPr>
                             <a:picLocks noChangeAspect="true"/>
                           </pic:cNvPicPr>
@@ -25599,18 +25568,18 @@
               <w:drawing>
                 <wp:inline distT="0" distR="0" distB="0" distL="0">
                   <wp:extent cx="203200" cy="177800"/>
-                  <wp:docPr id="68" name="Drawing 68" descr="file:/tmp/ViewElement__48vDwhVIEeetFdz5pzgWAw2272310703113293800.png"/>
+                  <wp:docPr id="63" name="Drawing 63" descr="file:/C:/Users/VINCEN~1/AppData/Local/Temp/ViewElement__48vDwhVIEeetFdz5pzgWAw8100435383758672935.png"/>
                   <a:graphic xmlns:a="http://schemas.openxmlformats.org/drawingml/2006/main">
                     <a:graphicData uri="http://schemas.openxmlformats.org/drawingml/2006/picture">
                       <pic:pic xmlns:pic="http://schemas.openxmlformats.org/drawingml/2006/picture">
                         <pic:nvPicPr>
-                          <pic:cNvPr id="0" name="Picture 68" descr="file:/tmp/ViewElement__48vDwhVIEeetFdz5pzgWAw2272310703113293800.png"/>
+                          <pic:cNvPr id="0" name="Picture 63" descr="file:/C:/Users/VINCEN~1/AppData/Local/Temp/ViewElement__48vDwhVIEeetFdz5pzgWAw8100435383758672935.png"/>
                           <pic:cNvPicPr>
                             <a:picLocks noChangeAspect="true"/>
                           </pic:cNvPicPr>
                         </pic:nvPicPr>
                         <pic:blipFill>
-                          <a:blip r:embed="rId24"/>
+                          <a:blip r:embed="rId19"/>
                           <a:stretch>
                             <a:fillRect/>
                           </a:stretch>
@@ -25659,18 +25628,18 @@
               <w:drawing>
                 <wp:inline distT="0" distR="0" distB="0" distL="0">
                   <wp:extent cx="203200" cy="177800"/>
-                  <wp:docPr id="69" name="Drawing 69" descr="file:/tmp/ViewElement__48vDxBVIEeetFdz5pzgWAw2771163007522341826.png"/>
+                  <wp:docPr id="64" name="Drawing 64" descr="file:/C:/Users/VINCEN~1/AppData/Local/Temp/ViewElement__48vDxBVIEeetFdz5pzgWAw11903982905197374767.png"/>
                   <a:graphic xmlns:a="http://schemas.openxmlformats.org/drawingml/2006/main">
                     <a:graphicData uri="http://schemas.openxmlformats.org/drawingml/2006/picture">
                       <pic:pic xmlns:pic="http://schemas.openxmlformats.org/drawingml/2006/picture">
                         <pic:nvPicPr>
-                          <pic:cNvPr id="0" name="Picture 69" descr="file:/tmp/ViewElement__48vDxBVIEeetFdz5pzgWAw2771163007522341826.png"/>
+                          <pic:cNvPr id="0" name="Picture 64" descr="file:/C:/Users/VINCEN~1/AppData/Local/Temp/ViewElement__48vDxBVIEeetFdz5pzgWAw11903982905197374767.png"/>
                           <pic:cNvPicPr>
                             <a:picLocks noChangeAspect="true"/>
                           </pic:cNvPicPr>
                         </pic:nvPicPr>
                         <pic:blipFill>
-                          <a:blip r:embed="rId24"/>
+                          <a:blip r:embed="rId19"/>
                           <a:stretch>
                             <a:fillRect/>
                           </a:stretch>
@@ -25719,18 +25688,18 @@
               <w:drawing>
                 <wp:inline distT="0" distR="0" distB="0" distL="0">
                   <wp:extent cx="203200" cy="177800"/>
-                  <wp:docPr id="70" name="Drawing 70" descr="file:/tmp/ViewElement__48vDxhVIEeetFdz5pzgWAw12899894596035890401.png"/>
+                  <wp:docPr id="65" name="Drawing 65" descr="file:/C:/Users/VINCEN~1/AppData/Local/Temp/ViewElement__48vDxhVIEeetFdz5pzgWAw6764135029835853860.png"/>
                   <a:graphic xmlns:a="http://schemas.openxmlformats.org/drawingml/2006/main">
                     <a:graphicData uri="http://schemas.openxmlformats.org/drawingml/2006/picture">
                       <pic:pic xmlns:pic="http://schemas.openxmlformats.org/drawingml/2006/picture">
                         <pic:nvPicPr>
-                          <pic:cNvPr id="0" name="Picture 70" descr="file:/tmp/ViewElement__48vDxhVIEeetFdz5pzgWAw12899894596035890401.png"/>
+                          <pic:cNvPr id="0" name="Picture 65" descr="file:/C:/Users/VINCEN~1/AppData/Local/Temp/ViewElement__48vDxhVIEeetFdz5pzgWAw6764135029835853860.png"/>
                           <pic:cNvPicPr>
                             <a:picLocks noChangeAspect="true"/>
                           </pic:cNvPicPr>
                         </pic:nvPicPr>
                         <pic:blipFill>
-                          <a:blip r:embed="rId24"/>
+                          <a:blip r:embed="rId19"/>
                           <a:stretch>
                             <a:fillRect/>
                           </a:stretch>
@@ -25779,18 +25748,18 @@
               <w:drawing>
                 <wp:inline distT="0" distR="0" distB="0" distL="0">
                   <wp:extent cx="203200" cy="190500"/>
-                  <wp:docPr id="71" name="Drawing 71" descr="file:/tmp/ViewElement__48vDyBVIEeetFdz5pzgWAw12346963205887033042.png"/>
+                  <wp:docPr id="66" name="Drawing 66" descr="file:/C:/Users/VINCEN~1/AppData/Local/Temp/ViewElement__48vDyBVIEeetFdz5pzgWAw10009180593174612564.png"/>
                   <a:graphic xmlns:a="http://schemas.openxmlformats.org/drawingml/2006/main">
                     <a:graphicData uri="http://schemas.openxmlformats.org/drawingml/2006/picture">
                       <pic:pic xmlns:pic="http://schemas.openxmlformats.org/drawingml/2006/picture">
                         <pic:nvPicPr>
-                          <pic:cNvPr id="0" name="Picture 71" descr="file:/tmp/ViewElement__48vDyBVIEeetFdz5pzgWAw12346963205887033042.png"/>
+                          <pic:cNvPr id="0" name="Picture 66" descr="file:/C:/Users/VINCEN~1/AppData/Local/Temp/ViewElement__48vDyBVIEeetFdz5pzgWAw10009180593174612564.png"/>
                           <pic:cNvPicPr>
                             <a:picLocks noChangeAspect="true"/>
                           </pic:cNvPicPr>
                         </pic:nvPicPr>
                         <pic:blipFill>
-                          <a:blip r:embed="rId26"/>
+                          <a:blip r:embed="rId21"/>
                           <a:stretch>
                             <a:fillRect/>
                           </a:stretch>
@@ -25839,18 +25808,18 @@
               <w:drawing>
                 <wp:inline distT="0" distR="0" distB="0" distL="0">
                   <wp:extent cx="203200" cy="190500"/>
-                  <wp:docPr id="72" name="Drawing 72" descr="file:/tmp/ViewElement__48vDzBVIEeetFdz5pzgWAw8061451783944092138.png"/>
+                  <wp:docPr id="67" name="Drawing 67" descr="file:/C:/Users/VINCEN~1/AppData/Local/Temp/ViewElement__48vDzBVIEeetFdz5pzgWAw6871999850244416782.png"/>
                   <a:graphic xmlns:a="http://schemas.openxmlformats.org/drawingml/2006/main">
                     <a:graphicData uri="http://schemas.openxmlformats.org/drawingml/2006/picture">
                       <pic:pic xmlns:pic="http://schemas.openxmlformats.org/drawingml/2006/picture">
                         <pic:nvPicPr>
-                          <pic:cNvPr id="0" name="Picture 72" descr="file:/tmp/ViewElement__48vDzBVIEeetFdz5pzgWAw8061451783944092138.png"/>
+                          <pic:cNvPr id="0" name="Picture 67" descr="file:/C:/Users/VINCEN~1/AppData/Local/Temp/ViewElement__48vDzBVIEeetFdz5pzgWAw6871999850244416782.png"/>
                           <pic:cNvPicPr>
                             <a:picLocks noChangeAspect="true"/>
                           </pic:cNvPicPr>
                         </pic:nvPicPr>
                         <pic:blipFill>
-                          <a:blip r:embed="rId26"/>
+                          <a:blip r:embed="rId21"/>
                           <a:stretch>
                             <a:fillRect/>
                           </a:stretch>
@@ -25946,12 +25915,12 @@
               <w:drawing>
                 <wp:inline distT="0" distR="0" distB="0" distL="0">
                   <wp:extent cx="203200" cy="203200"/>
-                  <wp:docPr id="73" name="Drawing 73" descr="file:/tmp/ViewContainer__48vDrhVIEeetFdz5pzgWAw2312758188048387673.png"/>
+                  <wp:docPr id="68" name="Drawing 68" descr="file:/C:/Users/VINCEN~1/AppData/Local/Temp/ViewContainer__48vDrhVIEeetFdz5pzgWAw5744910847202568917.png"/>
                   <a:graphic xmlns:a="http://schemas.openxmlformats.org/drawingml/2006/main">
                     <a:graphicData uri="http://schemas.openxmlformats.org/drawingml/2006/picture">
                       <pic:pic xmlns:pic="http://schemas.openxmlformats.org/drawingml/2006/picture">
                         <pic:nvPicPr>
-                          <pic:cNvPr id="0" name="Picture 73" descr="file:/tmp/ViewContainer__48vDrhVIEeetFdz5pzgWAw2312758188048387673.png"/>
+                          <pic:cNvPr id="0" name="Picture 68" descr="file:/C:/Users/VINCEN~1/AppData/Local/Temp/ViewContainer__48vDrhVIEeetFdz5pzgWAw5744910847202568917.png"/>
                           <pic:cNvPicPr>
                             <a:picLocks noChangeAspect="true"/>
                           </pic:cNvPicPr>
@@ -26006,18 +25975,18 @@
               <w:drawing>
                 <wp:inline distT="0" distR="0" distB="0" distL="0">
                   <wp:extent cx="203200" cy="177800"/>
-                  <wp:docPr id="74" name="Drawing 74" descr="file:/tmp/ViewElement__48vDsBVIEeetFdz5pzgWAw14608519882151813419.png"/>
+                  <wp:docPr id="69" name="Drawing 69" descr="file:/C:/Users/VINCEN~1/AppData/Local/Temp/ViewElement__48vDsBVIEeetFdz5pzgWAw105681192419922797.png"/>
                   <a:graphic xmlns:a="http://schemas.openxmlformats.org/drawingml/2006/main">
                     <a:graphicData uri="http://schemas.openxmlformats.org/drawingml/2006/picture">
                       <pic:pic xmlns:pic="http://schemas.openxmlformats.org/drawingml/2006/picture">
                         <pic:nvPicPr>
-                          <pic:cNvPr id="0" name="Picture 74" descr="file:/tmp/ViewElement__48vDsBVIEeetFdz5pzgWAw14608519882151813419.png"/>
+                          <pic:cNvPr id="0" name="Picture 69" descr="file:/C:/Users/VINCEN~1/AppData/Local/Temp/ViewElement__48vDsBVIEeetFdz5pzgWAw105681192419922797.png"/>
                           <pic:cNvPicPr>
                             <a:picLocks noChangeAspect="true"/>
                           </pic:cNvPicPr>
                         </pic:nvPicPr>
                         <pic:blipFill>
-                          <a:blip r:embed="rId24"/>
+                          <a:blip r:embed="rId19"/>
                           <a:stretch>
                             <a:fillRect/>
                           </a:stretch>
@@ -26066,18 +26035,18 @@
               <w:drawing>
                 <wp:inline distT="0" distR="0" distB="0" distL="0">
                   <wp:extent cx="203200" cy="203200"/>
-                  <wp:docPr id="75" name="Drawing 75" descr="file:/tmp/ViewElement__48vDshVIEeetFdz5pzgWAw2390043565135477331.png"/>
+                  <wp:docPr id="70" name="Drawing 70" descr="file:/C:/Users/VINCEN~1/AppData/Local/Temp/ViewElement__48vDshVIEeetFdz5pzgWAw2279536649128895431.png"/>
                   <a:graphic xmlns:a="http://schemas.openxmlformats.org/drawingml/2006/main">
                     <a:graphicData uri="http://schemas.openxmlformats.org/drawingml/2006/picture">
                       <pic:pic xmlns:pic="http://schemas.openxmlformats.org/drawingml/2006/picture">
                         <pic:nvPicPr>
-                          <pic:cNvPr id="0" name="Picture 75" descr="file:/tmp/ViewElement__48vDshVIEeetFdz5pzgWAw2390043565135477331.png"/>
+                          <pic:cNvPr id="0" name="Picture 70" descr="file:/C:/Users/VINCEN~1/AppData/Local/Temp/ViewElement__48vDshVIEeetFdz5pzgWAw2279536649128895431.png"/>
                           <pic:cNvPicPr>
                             <a:picLocks noChangeAspect="true"/>
                           </pic:cNvPicPr>
                         </pic:nvPicPr>
                         <pic:blipFill>
-                          <a:blip r:embed="rId25"/>
+                          <a:blip r:embed="rId20"/>
                           <a:stretch>
                             <a:fillRect/>
                           </a:stretch>
@@ -26126,18 +26095,18 @@
               <w:drawing>
                 <wp:inline distT="0" distR="0" distB="0" distL="0">
                   <wp:extent cx="203200" cy="190500"/>
-                  <wp:docPr id="76" name="Drawing 76" descr="file:/tmp/ViewElement__48vDtBVIEeetFdz5pzgWAw1466402457335299526.png"/>
+                  <wp:docPr id="71" name="Drawing 71" descr="file:/C:/Users/VINCEN~1/AppData/Local/Temp/ViewElement__48vDtBVIEeetFdz5pzgWAw6701573166135622637.png"/>
                   <a:graphic xmlns:a="http://schemas.openxmlformats.org/drawingml/2006/main">
                     <a:graphicData uri="http://schemas.openxmlformats.org/drawingml/2006/picture">
                       <pic:pic xmlns:pic="http://schemas.openxmlformats.org/drawingml/2006/picture">
                         <pic:nvPicPr>
-                          <pic:cNvPr id="0" name="Picture 76" descr="file:/tmp/ViewElement__48vDtBVIEeetFdz5pzgWAw1466402457335299526.png"/>
+                          <pic:cNvPr id="0" name="Picture 71" descr="file:/C:/Users/VINCEN~1/AppData/Local/Temp/ViewElement__48vDtBVIEeetFdz5pzgWAw6701573166135622637.png"/>
                           <pic:cNvPicPr>
                             <a:picLocks noChangeAspect="true"/>
                           </pic:cNvPicPr>
                         </pic:nvPicPr>
                         <pic:blipFill>
-                          <a:blip r:embed="rId26"/>
+                          <a:blip r:embed="rId21"/>
                           <a:stretch>
                             <a:fillRect/>
                           </a:stretch>
@@ -26186,18 +26155,18 @@
               <w:drawing>
                 <wp:inline distT="0" distR="0" distB="0" distL="0">
                   <wp:extent cx="203200" cy="190500"/>
-                  <wp:docPr id="77" name="Drawing 77" descr="file:/tmp/ViewElement__48vDuBVIEeetFdz5pzgWAw2753325094218711897.png"/>
+                  <wp:docPr id="72" name="Drawing 72" descr="file:/C:/Users/VINCEN~1/AppData/Local/Temp/ViewElement__48vDuBVIEeetFdz5pzgWAw4452863375753276639.png"/>
                   <a:graphic xmlns:a="http://schemas.openxmlformats.org/drawingml/2006/main">
                     <a:graphicData uri="http://schemas.openxmlformats.org/drawingml/2006/picture">
                       <pic:pic xmlns:pic="http://schemas.openxmlformats.org/drawingml/2006/picture">
                         <pic:nvPicPr>
-                          <pic:cNvPr id="0" name="Picture 77" descr="file:/tmp/ViewElement__48vDuBVIEeetFdz5pzgWAw2753325094218711897.png"/>
+                          <pic:cNvPr id="0" name="Picture 72" descr="file:/C:/Users/VINCEN~1/AppData/Local/Temp/ViewElement__48vDuBVIEeetFdz5pzgWAw4452863375753276639.png"/>
                           <pic:cNvPicPr>
                             <a:picLocks noChangeAspect="true"/>
                           </pic:cNvPicPr>
                         </pic:nvPicPr>
                         <pic:blipFill>
-                          <a:blip r:embed="rId26"/>
+                          <a:blip r:embed="rId21"/>
                           <a:stretch>
                             <a:fillRect/>
                           </a:stretch>
@@ -26246,18 +26215,18 @@
               <w:drawing>
                 <wp:inline distT="0" distR="0" distB="0" distL="0">
                   <wp:extent cx="203200" cy="177800"/>
-                  <wp:docPr id="78" name="Drawing 78" descr="file:/tmp/ViewElement__48vDvBVIEeetFdz5pzgWAw16930845205177967763.png"/>
+                  <wp:docPr id="73" name="Drawing 73" descr="file:/C:/Users/VINCEN~1/AppData/Local/Temp/ViewElement__48vDvBVIEeetFdz5pzgWAw14688313322836663545.png"/>
                   <a:graphic xmlns:a="http://schemas.openxmlformats.org/drawingml/2006/main">
                     <a:graphicData uri="http://schemas.openxmlformats.org/drawingml/2006/picture">
                       <pic:pic xmlns:pic="http://schemas.openxmlformats.org/drawingml/2006/picture">
                         <pic:nvPicPr>
-                          <pic:cNvPr id="0" name="Picture 78" descr="file:/tmp/ViewElement__48vDvBVIEeetFdz5pzgWAw16930845205177967763.png"/>
+                          <pic:cNvPr id="0" name="Picture 73" descr="file:/C:/Users/VINCEN~1/AppData/Local/Temp/ViewElement__48vDvBVIEeetFdz5pzgWAw14688313322836663545.png"/>
                           <pic:cNvPicPr>
                             <a:picLocks noChangeAspect="true"/>
                           </pic:cNvPicPr>
                         </pic:nvPicPr>
                         <pic:blipFill>
-                          <a:blip r:embed="rId23"/>
+                          <a:blip r:embed="rId18"/>
                           <a:stretch>
                             <a:fillRect/>
                           </a:stretch>
@@ -26353,12 +26322,12 @@
               <w:drawing>
                 <wp:inline distT="0" distR="0" distB="0" distL="0">
                   <wp:extent cx="203200" cy="203200"/>
-                  <wp:docPr id="79" name="Drawing 79" descr="file:/tmp/ViewContainer__48vDwBVIEeetFdz5pzgWAw2937808080379025462.png"/>
+                  <wp:docPr id="74" name="Drawing 74" descr="file:/C:/Users/VINCEN~1/AppData/Local/Temp/ViewContainer__48vDwBVIEeetFdz5pzgWAw8898431681344192615.png"/>
                   <a:graphic xmlns:a="http://schemas.openxmlformats.org/drawingml/2006/main">
                     <a:graphicData uri="http://schemas.openxmlformats.org/drawingml/2006/picture">
                       <pic:pic xmlns:pic="http://schemas.openxmlformats.org/drawingml/2006/picture">
                         <pic:nvPicPr>
-                          <pic:cNvPr id="0" name="Picture 79" descr="file:/tmp/ViewContainer__48vDwBVIEeetFdz5pzgWAw2937808080379025462.png"/>
+                          <pic:cNvPr id="0" name="Picture 74" descr="file:/C:/Users/VINCEN~1/AppData/Local/Temp/ViewContainer__48vDwBVIEeetFdz5pzgWAw8898431681344192615.png"/>
                           <pic:cNvPicPr>
                             <a:picLocks noChangeAspect="true"/>
                           </pic:cNvPicPr>
@@ -26413,18 +26382,18 @@
               <w:drawing>
                 <wp:inline distT="0" distR="0" distB="0" distL="0">
                   <wp:extent cx="203200" cy="177800"/>
-                  <wp:docPr id="80" name="Drawing 80" descr="file:/tmp/ViewElement__48vDwhVIEeetFdz5pzgWAw15770858472393753899.png"/>
+                  <wp:docPr id="75" name="Drawing 75" descr="file:/C:/Users/VINCEN~1/AppData/Local/Temp/ViewElement__48vDwhVIEeetFdz5pzgWAw16507126378790544218.png"/>
                   <a:graphic xmlns:a="http://schemas.openxmlformats.org/drawingml/2006/main">
                     <a:graphicData uri="http://schemas.openxmlformats.org/drawingml/2006/picture">
                       <pic:pic xmlns:pic="http://schemas.openxmlformats.org/drawingml/2006/picture">
                         <pic:nvPicPr>
-                          <pic:cNvPr id="0" name="Picture 80" descr="file:/tmp/ViewElement__48vDwhVIEeetFdz5pzgWAw15770858472393753899.png"/>
+                          <pic:cNvPr id="0" name="Picture 75" descr="file:/C:/Users/VINCEN~1/AppData/Local/Temp/ViewElement__48vDwhVIEeetFdz5pzgWAw16507126378790544218.png"/>
                           <pic:cNvPicPr>
                             <a:picLocks noChangeAspect="true"/>
                           </pic:cNvPicPr>
                         </pic:nvPicPr>
                         <pic:blipFill>
-                          <a:blip r:embed="rId24"/>
+                          <a:blip r:embed="rId19"/>
                           <a:stretch>
                             <a:fillRect/>
                           </a:stretch>
@@ -26473,18 +26442,18 @@
               <w:drawing>
                 <wp:inline distT="0" distR="0" distB="0" distL="0">
                   <wp:extent cx="203200" cy="177800"/>
-                  <wp:docPr id="81" name="Drawing 81" descr="file:/tmp/ViewElement__48vDxBVIEeetFdz5pzgWAw1070248259891127210.png"/>
+                  <wp:docPr id="76" name="Drawing 76" descr="file:/C:/Users/VINCEN~1/AppData/Local/Temp/ViewElement__48vDxBVIEeetFdz5pzgWAw2597176382677902825.png"/>
                   <a:graphic xmlns:a="http://schemas.openxmlformats.org/drawingml/2006/main">
                     <a:graphicData uri="http://schemas.openxmlformats.org/drawingml/2006/picture">
                       <pic:pic xmlns:pic="http://schemas.openxmlformats.org/drawingml/2006/picture">
                         <pic:nvPicPr>
-                          <pic:cNvPr id="0" name="Picture 81" descr="file:/tmp/ViewElement__48vDxBVIEeetFdz5pzgWAw1070248259891127210.png"/>
+                          <pic:cNvPr id="0" name="Picture 76" descr="file:/C:/Users/VINCEN~1/AppData/Local/Temp/ViewElement__48vDxBVIEeetFdz5pzgWAw2597176382677902825.png"/>
                           <pic:cNvPicPr>
                             <a:picLocks noChangeAspect="true"/>
                           </pic:cNvPicPr>
                         </pic:nvPicPr>
                         <pic:blipFill>
-                          <a:blip r:embed="rId24"/>
+                          <a:blip r:embed="rId19"/>
                           <a:stretch>
                             <a:fillRect/>
                           </a:stretch>
@@ -26533,18 +26502,18 @@
               <w:drawing>
                 <wp:inline distT="0" distR="0" distB="0" distL="0">
                   <wp:extent cx="203200" cy="177800"/>
-                  <wp:docPr id="82" name="Drawing 82" descr="file:/tmp/ViewElement__48vDxhVIEeetFdz5pzgWAw8495084182501680419.png"/>
+                  <wp:docPr id="77" name="Drawing 77" descr="file:/C:/Users/VINCEN~1/AppData/Local/Temp/ViewElement__48vDxhVIEeetFdz5pzgWAw1411448473271148678.png"/>
                   <a:graphic xmlns:a="http://schemas.openxmlformats.org/drawingml/2006/main">
                     <a:graphicData uri="http://schemas.openxmlformats.org/drawingml/2006/picture">
                       <pic:pic xmlns:pic="http://schemas.openxmlformats.org/drawingml/2006/picture">
                         <pic:nvPicPr>
-                          <pic:cNvPr id="0" name="Picture 82" descr="file:/tmp/ViewElement__48vDxhVIEeetFdz5pzgWAw8495084182501680419.png"/>
+                          <pic:cNvPr id="0" name="Picture 77" descr="file:/C:/Users/VINCEN~1/AppData/Local/Temp/ViewElement__48vDxhVIEeetFdz5pzgWAw1411448473271148678.png"/>
                           <pic:cNvPicPr>
                             <a:picLocks noChangeAspect="true"/>
                           </pic:cNvPicPr>
                         </pic:nvPicPr>
                         <pic:blipFill>
-                          <a:blip r:embed="rId24"/>
+                          <a:blip r:embed="rId19"/>
                           <a:stretch>
                             <a:fillRect/>
                           </a:stretch>
@@ -26593,18 +26562,18 @@
               <w:drawing>
                 <wp:inline distT="0" distR="0" distB="0" distL="0">
                   <wp:extent cx="203200" cy="190500"/>
-                  <wp:docPr id="83" name="Drawing 83" descr="file:/tmp/ViewElement__48vDyBVIEeetFdz5pzgWAw963073821406745315.png"/>
+                  <wp:docPr id="78" name="Drawing 78" descr="file:/C:/Users/VINCEN~1/AppData/Local/Temp/ViewElement__48vDyBVIEeetFdz5pzgWAw5598486497445709341.png"/>
                   <a:graphic xmlns:a="http://schemas.openxmlformats.org/drawingml/2006/main">
                     <a:graphicData uri="http://schemas.openxmlformats.org/drawingml/2006/picture">
                       <pic:pic xmlns:pic="http://schemas.openxmlformats.org/drawingml/2006/picture">
                         <pic:nvPicPr>
-                          <pic:cNvPr id="0" name="Picture 83" descr="file:/tmp/ViewElement__48vDyBVIEeetFdz5pzgWAw963073821406745315.png"/>
+                          <pic:cNvPr id="0" name="Picture 78" descr="file:/C:/Users/VINCEN~1/AppData/Local/Temp/ViewElement__48vDyBVIEeetFdz5pzgWAw5598486497445709341.png"/>
                           <pic:cNvPicPr>
                             <a:picLocks noChangeAspect="true"/>
                           </pic:cNvPicPr>
                         </pic:nvPicPr>
                         <pic:blipFill>
-                          <a:blip r:embed="rId26"/>
+                          <a:blip r:embed="rId21"/>
                           <a:stretch>
                             <a:fillRect/>
                           </a:stretch>
@@ -26653,18 +26622,18 @@
               <w:drawing>
                 <wp:inline distT="0" distR="0" distB="0" distL="0">
                   <wp:extent cx="203200" cy="190500"/>
-                  <wp:docPr id="84" name="Drawing 84" descr="file:/tmp/ViewElement__48vDzBVIEeetFdz5pzgWAw4209445003261584157.png"/>
+                  <wp:docPr id="79" name="Drawing 79" descr="file:/C:/Users/VINCEN~1/AppData/Local/Temp/ViewElement__48vDzBVIEeetFdz5pzgWAw2731962314053601220.png"/>
                   <a:graphic xmlns:a="http://schemas.openxmlformats.org/drawingml/2006/main">
                     <a:graphicData uri="http://schemas.openxmlformats.org/drawingml/2006/picture">
                       <pic:pic xmlns:pic="http://schemas.openxmlformats.org/drawingml/2006/picture">
                         <pic:nvPicPr>
-                          <pic:cNvPr id="0" name="Picture 84" descr="file:/tmp/ViewElement__48vDzBVIEeetFdz5pzgWAw4209445003261584157.png"/>
+                          <pic:cNvPr id="0" name="Picture 79" descr="file:/C:/Users/VINCEN~1/AppData/Local/Temp/ViewElement__48vDzBVIEeetFdz5pzgWAw2731962314053601220.png"/>
                           <pic:cNvPicPr>
                             <a:picLocks noChangeAspect="true"/>
                           </pic:cNvPicPr>
                         </pic:nvPicPr>
                         <pic:blipFill>
-                          <a:blip r:embed="rId26"/>
+                          <a:blip r:embed="rId21"/>
                           <a:stretch>
                             <a:fillRect/>
                           </a:stretch>
@@ -30728,7 +30697,7 @@
   <a:extraClrSchemeLst/>
   <a:extLst>
     <a:ext uri="{05A4C25C-085E-4340-85A3-A5531E510DB2}">
-      <thm15:themeFamily xmlns:thm15="http://schemas.microsoft.com/office/thememl/2012/main" xmlns="" name="Office Theme" id="{62F939B6-93AF-4DB8-9C6B-D6C7DFDC589F}" vid="{4A3C46E8-61CC-4603-A589-7422A47A8E4A}"/>
+      <thm15:themeFamily xmlns:thm15="http://schemas.microsoft.com/office/thememl/2012/main" name="Office Theme" id="{62F939B6-93AF-4DB8-9C6B-D6C7DFDC589F}" vid="{4A3C46E8-61CC-4603-A589-7422A47A8E4A}"/>
     </a:ext>
   </a:extLst>
 </a:theme>

</xml_diff>